<commit_message>
Manuals: impersonal wording (InfoServer operator rev 11 / assembly 1.5, RingClock-BitClock rev 6, WordClock 5 rev 6, Zev-7)
</commit_message>
<xml_diff>
--- a/InfoServer Assembly Manual.docx
+++ b/InfoServer Assembly Manual.docx
@@ -84,7 +84,7 @@
           <w:color w:val="000000"/>
           <w:sz w:val="24"/>
         </w:rPr>
-        <w:t>July 2026</w:t>
+        <w:t>October 2026</w:t>
       </w:r>
     </w:p>
     <w:p>
@@ -141,7 +141,7 @@
                 <w:rFonts w:ascii="Arial" w:hAnsi="Arial"/>
                 <w:sz w:val="22"/>
               </w:rPr>
-              <w:t>Document Revision 1.2</w:t>
+              <w:t>Document Revision 1.5</w:t>
             </w:r>
           </w:p>
         </w:tc>
@@ -174,7 +174,7 @@
                 <w:rFonts w:ascii="Arial" w:hAnsi="Arial"/>
                 <w:sz w:val="22"/>
               </w:rPr>
-              <w:t>2</w:t>
+              <w:t>6</w:t>
             </w:r>
           </w:p>
         </w:tc>
@@ -207,7 +207,7 @@
                 <w:rFonts w:ascii="Arial" w:hAnsi="Arial"/>
                 <w:sz w:val="22"/>
               </w:rPr>
-              <w:t>1.5</w:t>
+              <w:t>1.6</w:t>
             </w:r>
           </w:p>
         </w:tc>
@@ -248,8 +248,8 @@
     <w:p>
       <w:pPr>
         <w:sectPr>
-          <w:headerReference w:type="default" r:id="rId11"/>
-          <w:footerReference w:type="default" r:id="rId12"/>
+          <w:headerReference w:type="default" r:id="rId12"/>
+          <w:footerReference w:type="default" r:id="rId13"/>
           <w:pgSz w:w="12240" w:h="15840"/>
           <w:pgMar w:top="1440" w:right="1800" w:bottom="1440" w:left="1800" w:header="720" w:footer="720" w:gutter="0"/>
           <w:cols w:space="720"/>
@@ -545,8 +545,8 @@
     <w:p>
       <w:pPr>
         <w:sectPr>
-          <w:headerReference w:type="default" r:id="rId13"/>
-          <w:footerReference w:type="default" r:id="rId14"/>
+          <w:headerReference w:type="default" r:id="rId14"/>
+          <w:footerReference w:type="default" r:id="rId15"/>
           <w:pgSz w:w="12240" w:h="15840"/>
           <w:pgMar w:top="1440" w:right="1800" w:bottom="1440" w:left="1800" w:header="720" w:footer="720" w:gutter="0"/>
           <w:cols w:space="720"/>
@@ -687,7 +687,7 @@
       <w:r>
         <w:drawing>
           <wp:inline xmlns:a="http://schemas.openxmlformats.org/drawingml/2006/main" xmlns:pic="http://schemas.openxmlformats.org/drawingml/2006/picture">
-            <wp:extent cx="5943600" cy="3032647"/>
+            <wp:extent cx="5943600" cy="2900351"/>
             <wp:docPr id="1" name="Picture 1"/>
             <wp:cNvGraphicFramePr>
               <a:graphicFrameLocks noChangeAspect="1"/>
@@ -708,7 +708,7 @@
                   <pic:spPr>
                     <a:xfrm>
                       <a:off x="0" y="0"/>
-                      <a:ext cx="5943600" cy="3032647"/>
+                      <a:ext cx="5943600" cy="2900351"/>
                     </a:xfrm>
                     <a:prstGeom prst="rect"/>
                   </pic:spPr>
@@ -731,14 +731,14 @@
           <w:color w:val="555555"/>
           <w:sz w:val="20"/>
         </w:rPr>
-        <w:t>Figure 1 — Top-side component placement (Rev. 2 silkscreen). IC1 is the ESP32-S3 module; the GPS receiver is at the lower right.</w:t>
+        <w:t>Figure 1 — Top-side component placement (Rev. 6 silkscreen). IC1 is the ESP32-S3 module at the left end; the GPS receiver occupies the right-hand end of the board.</w:t>
       </w:r>
     </w:p>
     <w:p>
       <w:pPr>
         <w:sectPr>
-          <w:headerReference w:type="default" r:id="rId15"/>
-          <w:footerReference w:type="default" r:id="rId16"/>
+          <w:headerReference w:type="default" r:id="rId16"/>
+          <w:footerReference w:type="default" r:id="rId17"/>
           <w:pgSz w:w="12240" w:h="15840"/>
           <w:pgMar w:top="1440" w:right="1800" w:bottom="1440" w:left="1800" w:header="720" w:footer="720" w:gutter="0"/>
           <w:cols w:space="720"/>
@@ -917,8 +917,8 @@
     <w:p>
       <w:pPr>
         <w:sectPr>
-          <w:headerReference w:type="default" r:id="rId17"/>
-          <w:footerReference w:type="default" r:id="rId18"/>
+          <w:headerReference w:type="default" r:id="rId18"/>
+          <w:footerReference w:type="default" r:id="rId19"/>
           <w:pgSz w:w="12240" w:h="15840"/>
           <w:pgMar w:top="1440" w:right="1800" w:bottom="1440" w:left="1800" w:header="720" w:footer="720" w:gutter="0"/>
           <w:cols w:space="720"/>
@@ -988,7 +988,31 @@
           <w:rFonts w:ascii="Arial" w:hAnsi="Arial"/>
           <w:sz w:val="22"/>
         </w:rPr>
-        <w:t>Temperature-controlled soldering iron with a fine conical or chisel tip (recommended 330–350°C / 625–660°F)</w:t>
+        <w:t>Hot-air rework station or a reflow hotplate — required for the GPS module, whose pads are underneath it and cannot be reached with an iron</w:t>
+      </w:r>
+    </w:p>
+    <w:p>
+      <w:pPr>
+        <w:pStyle w:val="ListBullet"/>
+      </w:pPr>
+      <w:r>
+        <w:rPr>
+          <w:rFonts w:ascii="Arial" w:hAnsi="Arial"/>
+          <w:sz w:val="22"/>
+        </w:rPr>
+        <w:t>Solder paste (leaded or lead-free, in a syringe or with a stencil for the GPS footprint)</w:t>
+      </w:r>
+    </w:p>
+    <w:p>
+      <w:pPr>
+        <w:pStyle w:val="ListBullet"/>
+      </w:pPr>
+      <w:r>
+        <w:rPr>
+          <w:rFonts w:ascii="Arial" w:hAnsi="Arial"/>
+          <w:sz w:val="22"/>
+        </w:rPr>
+        <w:t>Temperature-controlled soldering iron with a fine conical or chisel tip (recommended 330–350°C / 625–660°F) for everything else</w:t>
       </w:r>
     </w:p>
     <w:p>
@@ -1144,8 +1168,8 @@
     <w:p>
       <w:pPr>
         <w:sectPr>
-          <w:headerReference w:type="default" r:id="rId19"/>
-          <w:footerReference w:type="default" r:id="rId20"/>
+          <w:headerReference w:type="default" r:id="rId20"/>
+          <w:footerReference w:type="default" r:id="rId21"/>
           <w:pgSz w:w="12240" w:h="15840"/>
           <w:pgMar w:top="1440" w:right="1800" w:bottom="1440" w:left="1800" w:header="720" w:footer="720" w:gutter="0"/>
           <w:cols w:space="720"/>
@@ -1197,7 +1221,7 @@
           <w:rFonts w:ascii="Arial" w:hAnsi="Arial"/>
           <w:sz w:val="22"/>
         </w:rPr>
-        <w:t>Install the GPS module first, while the board is bare and every pad is easy to reach. After the GPS module is in place, the remaining parts may be installed in any order — there is no required sequence for the rest of the board. Use Figure 1 (Section 1) to locate each reference designator, and inspect every joint under magnification as you go.</w:t>
+        <w:t>Install the GPS module first, while the board is bare. It is the one part that must be reflowed, and doing it on an empty board means the hot air or hotplate cannot disturb parts that are already down. After the GPS module is in place, the remaining parts may be installed in any order — there is no required sequence for the rest of the board. Use Figure 1 (Section 1) to locate each reference designator, and inspect every joint under magnification as each part is fitted.</w:t>
       </w:r>
     </w:p>
     <w:p>
@@ -1217,7 +1241,7 @@
           <w:color w:val="000000"/>
           <w:sz w:val="26"/>
         </w:rPr>
-        <w:t>4.1 Step 1: GPS Module (install first)</w:t>
+        <w:t>4.1 Step 1: GPS Module (install first, reflow only)</w:t>
       </w:r>
     </w:p>
     <w:p>
@@ -1226,7 +1250,7 @@
           <w:rFonts w:ascii="Arial" w:hAnsi="Arial"/>
           <w:sz w:val="22"/>
         </w:rPr>
-        <w:t>The GPS module (lower right of the board, labeled GPS — the u-blox SAM-M10Q) is installed before anything else so that no neighboring components block access to its pads or trap heat. Take your time aligning it — a rotated or skewed module is the one mistake that is hard to undo later.</w:t>
+        <w:t>The GPS module (the u-blox SAM-M10Q, at the right-hand end of the board, labeled GPS) is a land-grid-array part: its pads are on its underside, around the perimeter of the package. There is no opening in the board beneath it, so none of those pads can be reached with a soldering iron from either side. This module must be reflowed — with solder paste and either hot air or a hotplate. Do not attempt to solder it with an iron.</w:t>
       </w:r>
     </w:p>
     <w:p>
@@ -1241,7 +1265,7 @@
           <w:color w:val="000000"/>
           <w:sz w:val="22"/>
         </w:rPr>
-        <w:t>Align and tack</w:t>
+        <w:t>Paste and place</w:t>
       </w:r>
     </w:p>
     <w:p>
@@ -1254,7 +1278,7 @@
           <w:rFonts w:ascii="Arial" w:hAnsi="Arial"/>
           <w:sz w:val="22"/>
         </w:rPr>
-        <w:t>1.  Orient the module so the pin-1 dot on the GPS module lines up with the dot marked on the board. Do not rely on the outline alone — match the dots.</w:t>
+        <w:t>1.  Apply a small, even amount of solder paste to each pad on the footprint. A stencil gives the most consistent result; a fine syringe tip works well too. Even volume matters more than quantity — an overloaded pad bridges to its neighbour, and a dry one leaves an open joint that cannot be seen afterwards.</w:t>
       </w:r>
     </w:p>
     <w:p>
@@ -1267,7 +1291,7 @@
           <w:rFonts w:ascii="Arial" w:hAnsi="Arial"/>
           <w:sz w:val="22"/>
         </w:rPr>
-        <w:t>2.  Slightly wet a single pin at the top of the board with the iron, then tack that one pin in place from the bottom of the board. Use just enough solder to hold the module — this joint is only a temporary anchor.</w:t>
+        <w:t>2.  Orient the module so its pin-1 dot lines up with the dot marked on the board. Do not rely on the outline alone — match the dots.</w:t>
       </w:r>
     </w:p>
     <w:p>
@@ -1280,7 +1304,22 @@
           <w:rFonts w:ascii="Arial" w:hAnsi="Arial"/>
           <w:sz w:val="22"/>
         </w:rPr>
-        <w:t>3.  Before soldering anything else, check that every remaining pin is in perfect alignment with its pad. Sight down each row. If the module is skewed or shifted, re-melt the single tacked joint and nudge the module true, then re-check.</w:t>
+        <w:t>3.  Set the module down squarely on the paste and check the alignment on all four sides. Paste holds the part only lightly, so confirm the position now: once the joints are under the package there is nothing to inspect or nudge.</w:t>
+      </w:r>
+    </w:p>
+    <w:p>
+      <w:pPr>
+        <w:keepNext/>
+        <w:spacing w:before="200" w:after="40"/>
+      </w:pPr>
+      <w:r>
+        <w:rPr>
+          <w:rFonts w:ascii="Arial" w:hAnsi="Arial"/>
+          <w:b/>
+          <w:color w:val="000000"/>
+          <w:sz w:val="22"/>
+        </w:rPr>
+        <w:t>Reflow</w:t>
       </w:r>
     </w:p>
     <w:p>
@@ -1293,7 +1332,70 @@
           <w:rFonts w:ascii="Arial" w:hAnsi="Arial"/>
           <w:sz w:val="22"/>
         </w:rPr>
-        <w:t>4.  Only once all pins are confirmed in perfect alignment, solder the remaining pins. Reflow the original tack joint last so it matches the rest.</w:t>
+        <w:t>1.  Follow the profile specified for the solder paste. As a guide, preheat the board to about 150°C, then bring the joint area to the paste's peak — typically around 215°C for leaded paste or 245°C for lead-free — and hold only long enough for the paste to wet out.</w:t>
+      </w:r>
+    </w:p>
+    <w:p>
+      <w:pPr>
+        <w:spacing w:before="0" w:after="80"/>
+        <w:ind w:left="360" w:hanging="360"/>
+      </w:pPr>
+      <w:r>
+        <w:rPr>
+          <w:rFonts w:ascii="Arial" w:hAnsi="Arial"/>
+          <w:sz w:val="22"/>
+        </w:rPr>
+        <w:t>2.  Heat the area broadly and evenly rather than blasting one edge. With hot air, keep the nozzle moving and well back from the module so it does not lift.</w:t>
+      </w:r>
+    </w:p>
+    <w:p>
+      <w:pPr>
+        <w:spacing w:before="0" w:after="80"/>
+        <w:ind w:left="360" w:hanging="360"/>
+      </w:pPr>
+      <w:r>
+        <w:rPr>
+          <w:rFonts w:ascii="Arial" w:hAnsi="Arial"/>
+          <w:sz w:val="22"/>
+        </w:rPr>
+        <w:t>3.  Watch for the moment the paste turns to solder: the module will settle slightly and, if the paste volumes are even, surface tension pulls it square. That settle is the sign the joints have formed.</w:t>
+      </w:r>
+    </w:p>
+    <w:p>
+      <w:pPr>
+        <w:spacing w:before="0" w:after="80"/>
+        <w:ind w:left="360" w:hanging="360"/>
+      </w:pPr>
+      <w:r>
+        <w:rPr>
+          <w:rFonts w:ascii="Arial" w:hAnsi="Arial"/>
+          <w:sz w:val="22"/>
+        </w:rPr>
+        <w:t>4.  Let the board cool undisturbed. Moving the module while the solder is still plastic is what causes the cold joints that cannot be seen.</w:t>
+      </w:r>
+    </w:p>
+    <w:p>
+      <w:pPr>
+        <w:keepNext/>
+        <w:spacing w:before="200" w:after="40"/>
+      </w:pPr>
+      <w:r>
+        <w:rPr>
+          <w:rFonts w:ascii="Arial" w:hAnsi="Arial"/>
+          <w:b/>
+          <w:color w:val="000000"/>
+          <w:sz w:val="22"/>
+        </w:rPr>
+        <w:t>Verify</w:t>
+      </w:r>
+    </w:p>
+    <w:p>
+      <w:r>
+        <w:rPr>
+          <w:rFonts w:ascii="Arial" w:hAnsi="Arial"/>
+          <w:sz w:val="22"/>
+        </w:rPr>
+        <w:t>Because the joints are hidden, inspect indirectly. Look around the edge of the package for solder that has squeezed out between pads, which indicates a bridge. Confirm the module has not shifted off its outline. Then check continuity from the module's supply and ground to the corresponding nets, and — once the board is running — confirm the receiver is talking and can reach a fix, which exercises the power, serial, and 1PPS connections together.</w:t>
       </w:r>
     </w:p>
     <w:p>
@@ -1319,7 +1421,7 @@
           <w:color w:val="000000"/>
           <w:sz w:val="22"/>
         </w:rPr>
-        <w:t>Verify the pin-1 dot alignment before tacking and verify full pin alignment before soldering the rest. A module soldered rotated must be removed with hot air — there is no easy fix once all pins are down.</w:t>
+        <w:t>Verify the pin-1 dot alignment before applying heat. A module reflowed rotated must be removed with hot air, and reworking an LGA package on a populated board risks the parts around it. Do not try to fix a suspected joint with an iron — the pads are not accessible, and the only correct repair is to reflow the module again.</w:t>
       </w:r>
     </w:p>
     <w:p>
@@ -1348,7 +1450,7 @@
           <w:rFonts w:ascii="Arial" w:hAnsi="Arial"/>
           <w:sz w:val="22"/>
         </w:rPr>
-        <w:t>Install the ESP32-S3-WROOM-1 module (IC1, center of the board) using the same technique as the GPS module.</w:t>
+        <w:t>Install the ESP32-S3-WROOM-1 module (IC1, at the left-hand end of the board). Unlike the GPS module, its pads are castellations along the two long edges and are fully accessible from the top, so this one is soldered with an iron.</w:t>
       </w:r>
     </w:p>
     <w:p>
@@ -1483,7 +1585,7 @@
           <w:rFonts w:ascii="Arial" w:hAnsi="Arial"/>
           <w:sz w:val="22"/>
         </w:rPr>
-        <w:t>3.  U3 — AP2112K-3.3 V LDO regulator (SOT-23-5), by the +3.3 V net at the upper left.</w:t>
+        <w:t>3.  U3 — AP2112K-3.3 V LDO regulator (SOT-23-5), at the lower left beside the USB-C connector.</w:t>
       </w:r>
     </w:p>
     <w:p>
@@ -1524,7 +1626,7 @@
           <w:rFonts w:ascii="Arial" w:hAnsi="Arial"/>
           <w:sz w:val="22"/>
         </w:rPr>
-        <w:t>1.  LED1 (STATUS) and LED2 (ACTIVITY) — the two APA102 indicators on the top of the board, by the right edge.</w:t>
+        <w:t>1.  LED1 (STATUS) and LED2 (ACTIVITY) — the two APA102 indicators on the top of the board, along the lower edge below U1; both are labelled on the silkscreen.</w:t>
       </w:r>
     </w:p>
     <w:p>
@@ -1591,7 +1693,7 @@
           <w:rFonts w:ascii="Arial" w:hAnsi="Arial"/>
           <w:sz w:val="22"/>
         </w:rPr>
-        <w:t>1.  Resistors R1–R9 and capacitors C1–C7 — including the I²C pull-ups and the reset pull-up (R1).</w:t>
+        <w:t>1.  Resistors R1–R10 and capacitors C1–C9 — including the I²C pull-ups (R8, R9), the DS3231 ~RST pull-up (R1), and the GPS RESET_N pull-up (R10).</w:t>
       </w:r>
     </w:p>
     <w:p>
@@ -1604,7 +1706,7 @@
           <w:rFonts w:ascii="Arial" w:hAnsi="Arial"/>
           <w:sz w:val="22"/>
         </w:rPr>
-        <w:t>2.  SW1 (function button) and SW2 (EN / hardware reset).</w:t>
+        <w:t>2.  FB — the ferrite bead feeding the GPS supply. It is not polarized, but do not substitute a 0 Ω link: it is there to keep switching noise off the receiver.</w:t>
       </w:r>
     </w:p>
     <w:p>
@@ -1617,7 +1719,7 @@
           <w:rFonts w:ascii="Arial" w:hAnsi="Arial"/>
           <w:sz w:val="22"/>
         </w:rPr>
-        <w:t>3.  J2 and the coin-cell holder (J3) — observe coin-cell polarity, + side up.</w:t>
+        <w:t>3.  SW1 — the function button. It is the only switch on the board; there is no separate reset button, and EN and IO0 are brought out on J2 instead.</w:t>
       </w:r>
     </w:p>
     <w:p>
@@ -1630,7 +1732,33 @@
           <w:rFonts w:ascii="Arial" w:hAnsi="Arial"/>
           <w:sz w:val="22"/>
         </w:rPr>
-        <w:t>4.  J1 — the USB-C connector. Seat it flat and fully before soldering the shield tabs.</w:t>
+        <w:t>4.  J2 (serial / programming header) and the coin-cell holder (J3) — observe coin-cell polarity, + side up.</w:t>
+      </w:r>
+    </w:p>
+    <w:p>
+      <w:pPr>
+        <w:spacing w:before="0" w:after="80"/>
+        <w:ind w:left="360" w:hanging="360"/>
+      </w:pPr>
+      <w:r>
+        <w:rPr>
+          <w:rFonts w:ascii="Arial" w:hAnsi="Arial"/>
+          <w:sz w:val="22"/>
+        </w:rPr>
+        <w:t>5.  J4 — the 4-pin environmental sensor header, if a sensor is being fitted. The silkscreen labels each pin (SDA, SCL, GND, 3.3v); match them to the sensor module rather than assuming a pin order. A BME280 or a BME688 may be mounted directly here, or sited away from the board on a short ribbon cable — the firmware identifies which part is fitted at power-on, so no setting has to be changed to match.</w:t>
+      </w:r>
+    </w:p>
+    <w:p>
+      <w:pPr>
+        <w:spacing w:before="0" w:after="80"/>
+        <w:ind w:left="360" w:hanging="360"/>
+      </w:pPr>
+      <w:r>
+        <w:rPr>
+          <w:rFonts w:ascii="Arial" w:hAnsi="Arial"/>
+          <w:sz w:val="22"/>
+        </w:rPr>
+        <w:t>6.  J1 — the USB-C connector. Seat it flat and fully before soldering the shield tabs.</w:t>
       </w:r>
     </w:p>
     <w:p>
@@ -1641,7 +1769,7 @@
       <w:r>
         <w:drawing>
           <wp:inline xmlns:a="http://schemas.openxmlformats.org/drawingml/2006/main" xmlns:pic="http://schemas.openxmlformats.org/drawingml/2006/picture">
-            <wp:extent cx="5943600" cy="3032647"/>
+            <wp:extent cx="5943600" cy="2750756"/>
             <wp:docPr id="2" name="Picture 2"/>
             <wp:cNvGraphicFramePr>
               <a:graphicFrameLocks noChangeAspect="1"/>
@@ -1662,7 +1790,7 @@
                   <pic:spPr>
                     <a:xfrm>
                       <a:off x="0" y="0"/>
-                      <a:ext cx="5943600" cy="3032647"/>
+                      <a:ext cx="5943600" cy="2750756"/>
                     </a:xfrm>
                     <a:prstGeom prst="rect"/>
                   </pic:spPr>
@@ -1691,8 +1819,8 @@
     <w:p>
       <w:pPr>
         <w:sectPr>
-          <w:headerReference w:type="default" r:id="rId21"/>
-          <w:footerReference w:type="default" r:id="rId22"/>
+          <w:headerReference w:type="default" r:id="rId22"/>
+          <w:footerReference w:type="default" r:id="rId23"/>
           <w:pgSz w:w="12240" w:h="15840"/>
           <w:pgMar w:top="1440" w:right="1800" w:bottom="1440" w:left="1800" w:header="720" w:footer="720" w:gutter="0"/>
           <w:cols w:space="720"/>
@@ -1874,7 +2002,7 @@
           <w:rFonts w:ascii="Arial" w:hAnsi="Arial"/>
           <w:sz w:val="22"/>
         </w:rPr>
-        <w:t>4.  From a phone or PC, join that network and browse to 192.168.4.1. At a minimum, select your home network and enter its password, choose the discipline mode (leave it on NMEA GPS), then Save and Start. The unit reboots onto your network.</w:t>
+        <w:t>4.  From a phone or PC, join that network and browse to 192.168.4.1. At a minimum, select the home network and enter its password, choose the discipline mode (leave it on NMEA GPS), then Save and Start. The unit reboots onto the home network.</w:t>
       </w:r>
     </w:p>
     <w:p>
@@ -1935,8 +2063,8 @@
     <w:p>
       <w:pPr>
         <w:sectPr>
-          <w:headerReference w:type="default" r:id="rId23"/>
-          <w:footerReference w:type="default" r:id="rId24"/>
+          <w:headerReference w:type="default" r:id="rId24"/>
+          <w:footerReference w:type="default" r:id="rId25"/>
           <w:pgSz w:w="12240" w:h="15840"/>
           <w:pgMar w:top="1440" w:right="1800" w:bottom="1440" w:left="1800" w:header="720" w:footer="720" w:gutter="0"/>
           <w:cols w:space="720"/>
@@ -1994,12 +2122,18 @@
         <w:gridCol w:w="2880"/>
       </w:tblGrid>
       <w:tr>
+        <w:trPr>
+          <w:cantSplit/>
+        </w:trPr>
         <w:tc>
           <w:tcPr>
             <w:tcW w:type="dxa" w:w="2880"/>
             <w:shd w:val="clear" w:color="auto" w:fill="C25600"/>
           </w:tcPr>
           <w:p>
+            <w:pPr>
+              <w:keepNext/>
+            </w:pPr>
             <w:r>
               <w:rPr>
                 <w:rFonts w:ascii="Arial" w:hAnsi="Arial"/>
@@ -2017,6 +2151,9 @@
             <w:shd w:val="clear" w:color="auto" w:fill="C25600"/>
           </w:tcPr>
           <w:p>
+            <w:pPr>
+              <w:keepNext/>
+            </w:pPr>
             <w:r>
               <w:rPr>
                 <w:rFonts w:ascii="Arial" w:hAnsi="Arial"/>
@@ -2034,6 +2171,9 @@
             <w:shd w:val="clear" w:color="auto" w:fill="C25600"/>
           </w:tcPr>
           <w:p>
+            <w:pPr>
+              <w:keepNext/>
+            </w:pPr>
             <w:r>
               <w:rPr>
                 <w:rFonts w:ascii="Arial" w:hAnsi="Arial"/>
@@ -2047,11 +2187,17 @@
         </w:tc>
       </w:tr>
       <w:tr>
+        <w:trPr>
+          <w:cantSplit/>
+        </w:trPr>
         <w:tc>
           <w:tcPr>
             <w:tcW w:type="dxa" w:w="2880"/>
           </w:tcPr>
           <w:p>
+            <w:pPr>
+              <w:keepNext/>
+            </w:pPr>
             <w:r>
               <w:rPr>
                 <w:rFonts w:ascii="Arial" w:hAnsi="Arial"/>
@@ -2066,6 +2212,9 @@
             <w:tcW w:type="dxa" w:w="2880"/>
           </w:tcPr>
           <w:p>
+            <w:pPr>
+              <w:keepNext/>
+            </w:pPr>
             <w:r>
               <w:rPr>
                 <w:rFonts w:ascii="Arial" w:hAnsi="Arial"/>
@@ -2080,6 +2229,9 @@
             <w:tcW w:type="dxa" w:w="2880"/>
           </w:tcPr>
           <w:p>
+            <w:pPr>
+              <w:keepNext/>
+            </w:pPr>
             <w:r>
               <w:rPr>
                 <w:rFonts w:ascii="Arial" w:hAnsi="Arial"/>
@@ -2091,11 +2243,17 @@
         </w:tc>
       </w:tr>
       <w:tr>
+        <w:trPr>
+          <w:cantSplit/>
+        </w:trPr>
         <w:tc>
           <w:tcPr>
             <w:tcW w:type="dxa" w:w="2880"/>
           </w:tcPr>
           <w:p>
+            <w:pPr>
+              <w:keepNext/>
+            </w:pPr>
             <w:r>
               <w:rPr>
                 <w:rFonts w:ascii="Arial" w:hAnsi="Arial"/>
@@ -2110,6 +2268,9 @@
             <w:tcW w:type="dxa" w:w="2880"/>
           </w:tcPr>
           <w:p>
+            <w:pPr>
+              <w:keepNext/>
+            </w:pPr>
             <w:r>
               <w:rPr>
                 <w:rFonts w:ascii="Arial" w:hAnsi="Arial"/>
@@ -2124,6 +2285,9 @@
             <w:tcW w:type="dxa" w:w="2880"/>
           </w:tcPr>
           <w:p>
+            <w:pPr>
+              <w:keepNext/>
+            </w:pPr>
             <w:r>
               <w:rPr>
                 <w:rFonts w:ascii="Arial" w:hAnsi="Arial"/>
@@ -2135,11 +2299,17 @@
         </w:tc>
       </w:tr>
       <w:tr>
+        <w:trPr>
+          <w:cantSplit/>
+        </w:trPr>
         <w:tc>
           <w:tcPr>
             <w:tcW w:type="dxa" w:w="2880"/>
           </w:tcPr>
           <w:p>
+            <w:pPr>
+              <w:keepNext/>
+            </w:pPr>
             <w:r>
               <w:rPr>
                 <w:rFonts w:ascii="Arial" w:hAnsi="Arial"/>
@@ -2154,6 +2324,9 @@
             <w:tcW w:type="dxa" w:w="2880"/>
           </w:tcPr>
           <w:p>
+            <w:pPr>
+              <w:keepNext/>
+            </w:pPr>
             <w:r>
               <w:rPr>
                 <w:rFonts w:ascii="Arial" w:hAnsi="Arial"/>
@@ -2168,6 +2341,9 @@
             <w:tcW w:type="dxa" w:w="2880"/>
           </w:tcPr>
           <w:p>
+            <w:pPr>
+              <w:keepNext/>
+            </w:pPr>
             <w:r>
               <w:rPr>
                 <w:rFonts w:ascii="Arial" w:hAnsi="Arial"/>
@@ -2179,11 +2355,17 @@
         </w:tc>
       </w:tr>
       <w:tr>
+        <w:trPr>
+          <w:cantSplit/>
+        </w:trPr>
         <w:tc>
           <w:tcPr>
             <w:tcW w:type="dxa" w:w="2880"/>
           </w:tcPr>
           <w:p>
+            <w:pPr>
+              <w:keepNext/>
+            </w:pPr>
             <w:r>
               <w:rPr>
                 <w:rFonts w:ascii="Arial" w:hAnsi="Arial"/>
@@ -2198,6 +2380,9 @@
             <w:tcW w:type="dxa" w:w="2880"/>
           </w:tcPr>
           <w:p>
+            <w:pPr>
+              <w:keepNext/>
+            </w:pPr>
             <w:r>
               <w:rPr>
                 <w:rFonts w:ascii="Arial" w:hAnsi="Arial"/>
@@ -2212,6 +2397,9 @@
             <w:tcW w:type="dxa" w:w="2880"/>
           </w:tcPr>
           <w:p>
+            <w:pPr>
+              <w:keepNext/>
+            </w:pPr>
             <w:r>
               <w:rPr>
                 <w:rFonts w:ascii="Arial" w:hAnsi="Arial"/>
@@ -2223,11 +2411,17 @@
         </w:tc>
       </w:tr>
       <w:tr>
+        <w:trPr>
+          <w:cantSplit/>
+        </w:trPr>
         <w:tc>
           <w:tcPr>
             <w:tcW w:type="dxa" w:w="2880"/>
           </w:tcPr>
           <w:p>
+            <w:pPr>
+              <w:keepNext/>
+            </w:pPr>
             <w:r>
               <w:rPr>
                 <w:rFonts w:ascii="Arial" w:hAnsi="Arial"/>
@@ -2242,6 +2436,9 @@
             <w:tcW w:type="dxa" w:w="2880"/>
           </w:tcPr>
           <w:p>
+            <w:pPr>
+              <w:keepNext/>
+            </w:pPr>
             <w:r>
               <w:rPr>
                 <w:rFonts w:ascii="Arial" w:hAnsi="Arial"/>
@@ -2256,6 +2453,9 @@
             <w:tcW w:type="dxa" w:w="2880"/>
           </w:tcPr>
           <w:p>
+            <w:pPr>
+              <w:keepNext/>
+            </w:pPr>
             <w:r>
               <w:rPr>
                 <w:rFonts w:ascii="Arial" w:hAnsi="Arial"/>
@@ -2267,11 +2467,17 @@
         </w:tc>
       </w:tr>
       <w:tr>
+        <w:trPr>
+          <w:cantSplit/>
+        </w:trPr>
         <w:tc>
           <w:tcPr>
             <w:tcW w:type="dxa" w:w="2880"/>
           </w:tcPr>
           <w:p>
+            <w:pPr>
+              <w:keepNext/>
+            </w:pPr>
             <w:r>
               <w:rPr>
                 <w:rFonts w:ascii="Arial" w:hAnsi="Arial"/>
@@ -2286,6 +2492,9 @@
             <w:tcW w:type="dxa" w:w="2880"/>
           </w:tcPr>
           <w:p>
+            <w:pPr>
+              <w:keepNext/>
+            </w:pPr>
             <w:r>
               <w:rPr>
                 <w:rFonts w:ascii="Arial" w:hAnsi="Arial"/>
@@ -2300,6 +2509,9 @@
             <w:tcW w:type="dxa" w:w="2880"/>
           </w:tcPr>
           <w:p>
+            <w:pPr>
+              <w:keepNext/>
+            </w:pPr>
             <w:r>
               <w:rPr>
                 <w:rFonts w:ascii="Arial" w:hAnsi="Arial"/>
@@ -2311,11 +2523,17 @@
         </w:tc>
       </w:tr>
       <w:tr>
+        <w:trPr>
+          <w:cantSplit/>
+        </w:trPr>
         <w:tc>
           <w:tcPr>
             <w:tcW w:type="dxa" w:w="2880"/>
           </w:tcPr>
           <w:p>
+            <w:pPr>
+              <w:keepNext/>
+            </w:pPr>
             <w:r>
               <w:rPr>
                 <w:rFonts w:ascii="Arial" w:hAnsi="Arial"/>
@@ -2330,6 +2548,9 @@
             <w:tcW w:type="dxa" w:w="2880"/>
           </w:tcPr>
           <w:p>
+            <w:pPr>
+              <w:keepNext/>
+            </w:pPr>
             <w:r>
               <w:rPr>
                 <w:rFonts w:ascii="Arial" w:hAnsi="Arial"/>
@@ -2344,6 +2565,9 @@
             <w:tcW w:type="dxa" w:w="2880"/>
           </w:tcPr>
           <w:p>
+            <w:pPr>
+              <w:keepNext/>
+            </w:pPr>
             <w:r>
               <w:rPr>
                 <w:rFonts w:ascii="Arial" w:hAnsi="Arial"/>
@@ -2355,11 +2579,17 @@
         </w:tc>
       </w:tr>
       <w:tr>
+        <w:trPr>
+          <w:cantSplit/>
+        </w:trPr>
         <w:tc>
           <w:tcPr>
             <w:tcW w:type="dxa" w:w="2880"/>
           </w:tcPr>
           <w:p>
+            <w:pPr>
+              <w:keepNext/>
+            </w:pPr>
             <w:r>
               <w:rPr>
                 <w:rFonts w:ascii="Arial" w:hAnsi="Arial"/>
@@ -2374,6 +2604,9 @@
             <w:tcW w:type="dxa" w:w="2880"/>
           </w:tcPr>
           <w:p>
+            <w:pPr>
+              <w:keepNext/>
+            </w:pPr>
             <w:r>
               <w:rPr>
                 <w:rFonts w:ascii="Arial" w:hAnsi="Arial"/>
@@ -2388,6 +2621,9 @@
             <w:tcW w:type="dxa" w:w="2880"/>
           </w:tcPr>
           <w:p>
+            <w:pPr>
+              <w:keepNext/>
+            </w:pPr>
             <w:r>
               <w:rPr>
                 <w:rFonts w:ascii="Arial" w:hAnsi="Arial"/>
@@ -2399,6 +2635,9 @@
         </w:tc>
       </w:tr>
       <w:tr>
+        <w:trPr>
+          <w:cantSplit/>
+        </w:trPr>
         <w:tc>
           <w:tcPr>
             <w:tcW w:type="dxa" w:w="2880"/>
@@ -2447,8 +2686,8 @@
     <w:p>
       <w:pPr>
         <w:sectPr>
-          <w:headerReference w:type="default" r:id="rId25"/>
-          <w:footerReference w:type="default" r:id="rId26"/>
+          <w:headerReference w:type="default" r:id="rId26"/>
+          <w:footerReference w:type="default" r:id="rId27"/>
           <w:pgSz w:w="12240" w:h="15840"/>
           <w:pgMar w:top="1440" w:right="1800" w:bottom="1440" w:left="1800" w:header="720" w:footer="720" w:gutter="0"/>
           <w:cols w:space="720"/>
@@ -2500,7 +2739,7 @@
           <w:rFonts w:ascii="Arial" w:hAnsi="Arial"/>
           <w:sz w:val="22"/>
         </w:rPr>
-        <w:t>Reference designators, parts, and values are taken from the Rev. 2 schematic and board silkscreen (see Figures 1 and 2). Quantities are for one unit.</w:t>
+        <w:t>Reference designators, parts, and values are taken from the Rev. 6 schematic (Figure 3) and board silkscreen (Figures 1 and 2). Quantities are for one unit.</w:t>
       </w:r>
     </w:p>
     <w:p>
@@ -2532,12 +2771,18 @@
         <w:gridCol w:w="1728"/>
       </w:tblGrid>
       <w:tr>
+        <w:trPr>
+          <w:cantSplit/>
+        </w:trPr>
         <w:tc>
           <w:tcPr>
             <w:tcW w:type="dxa" w:w="1728"/>
             <w:shd w:val="clear" w:color="auto" w:fill="C25600"/>
           </w:tcPr>
           <w:p>
+            <w:pPr>
+              <w:keepNext/>
+            </w:pPr>
             <w:r>
               <w:rPr>
                 <w:rFonts w:ascii="Arial" w:hAnsi="Arial"/>
@@ -2555,6 +2800,9 @@
             <w:shd w:val="clear" w:color="auto" w:fill="C25600"/>
           </w:tcPr>
           <w:p>
+            <w:pPr>
+              <w:keepNext/>
+            </w:pPr>
             <w:r>
               <w:rPr>
                 <w:rFonts w:ascii="Arial" w:hAnsi="Arial"/>
@@ -2572,6 +2820,9 @@
             <w:shd w:val="clear" w:color="auto" w:fill="C25600"/>
           </w:tcPr>
           <w:p>
+            <w:pPr>
+              <w:keepNext/>
+            </w:pPr>
             <w:r>
               <w:rPr>
                 <w:rFonts w:ascii="Arial" w:hAnsi="Arial"/>
@@ -2589,6 +2840,9 @@
             <w:shd w:val="clear" w:color="auto" w:fill="C25600"/>
           </w:tcPr>
           <w:p>
+            <w:pPr>
+              <w:keepNext/>
+            </w:pPr>
             <w:r>
               <w:rPr>
                 <w:rFonts w:ascii="Arial" w:hAnsi="Arial"/>
@@ -2606,6 +2860,9 @@
             <w:shd w:val="clear" w:color="auto" w:fill="C25600"/>
           </w:tcPr>
           <w:p>
+            <w:pPr>
+              <w:keepNext/>
+            </w:pPr>
             <w:r>
               <w:rPr>
                 <w:rFonts w:ascii="Arial" w:hAnsi="Arial"/>
@@ -2619,11 +2876,17 @@
         </w:tc>
       </w:tr>
       <w:tr>
+        <w:trPr>
+          <w:cantSplit/>
+        </w:trPr>
         <w:tc>
           <w:tcPr>
             <w:tcW w:type="dxa" w:w="1728"/>
           </w:tcPr>
           <w:p>
+            <w:pPr>
+              <w:keepNext/>
+            </w:pPr>
             <w:r>
               <w:rPr>
                 <w:rFonts w:ascii="Arial" w:hAnsi="Arial"/>
@@ -2638,6 +2901,9 @@
             <w:tcW w:type="dxa" w:w="1728"/>
           </w:tcPr>
           <w:p>
+            <w:pPr>
+              <w:keepNext/>
+            </w:pPr>
             <w:r>
               <w:rPr>
                 <w:rFonts w:ascii="Arial" w:hAnsi="Arial"/>
@@ -2652,6 +2918,9 @@
             <w:tcW w:type="dxa" w:w="1728"/>
           </w:tcPr>
           <w:p>
+            <w:pPr>
+              <w:keepNext/>
+            </w:pPr>
             <w:r>
               <w:rPr>
                 <w:rFonts w:ascii="Arial" w:hAnsi="Arial"/>
@@ -2666,6 +2935,9 @@
             <w:tcW w:type="dxa" w:w="1728"/>
           </w:tcPr>
           <w:p>
+            <w:pPr>
+              <w:keepNext/>
+            </w:pPr>
             <w:r>
               <w:rPr>
                 <w:rFonts w:ascii="Arial" w:hAnsi="Arial"/>
@@ -2680,6 +2952,9 @@
             <w:tcW w:type="dxa" w:w="1728"/>
           </w:tcPr>
           <w:p>
+            <w:pPr>
+              <w:keepNext/>
+            </w:pPr>
             <w:r>
               <w:rPr>
                 <w:rFonts w:ascii="Arial" w:hAnsi="Arial"/>
@@ -2691,6 +2966,9 @@
         </w:tc>
       </w:tr>
       <w:tr>
+        <w:trPr>
+          <w:cantSplit/>
+        </w:trPr>
         <w:tc>
           <w:tcPr>
             <w:tcW w:type="dxa" w:w="1728"/>
@@ -2776,7 +3054,7 @@
           <w:color w:val="000000"/>
           <w:sz w:val="22"/>
         </w:rPr>
-        <w:t>Integrated Circuits and Diode</w:t>
+        <w:t>Integrated Circuits, Diode, and Ferrite</w:t>
       </w:r>
     </w:p>
     <w:tbl>
@@ -2793,12 +3071,18 @@
         <w:gridCol w:w="1728"/>
       </w:tblGrid>
       <w:tr>
+        <w:trPr>
+          <w:cantSplit/>
+        </w:trPr>
         <w:tc>
           <w:tcPr>
             <w:tcW w:type="dxa" w:w="1728"/>
             <w:shd w:val="clear" w:color="auto" w:fill="C25600"/>
           </w:tcPr>
           <w:p>
+            <w:pPr>
+              <w:keepNext/>
+            </w:pPr>
             <w:r>
               <w:rPr>
                 <w:rFonts w:ascii="Arial" w:hAnsi="Arial"/>
@@ -2816,6 +3100,9 @@
             <w:shd w:val="clear" w:color="auto" w:fill="C25600"/>
           </w:tcPr>
           <w:p>
+            <w:pPr>
+              <w:keepNext/>
+            </w:pPr>
             <w:r>
               <w:rPr>
                 <w:rFonts w:ascii="Arial" w:hAnsi="Arial"/>
@@ -2833,6 +3120,9 @@
             <w:shd w:val="clear" w:color="auto" w:fill="C25600"/>
           </w:tcPr>
           <w:p>
+            <w:pPr>
+              <w:keepNext/>
+            </w:pPr>
             <w:r>
               <w:rPr>
                 <w:rFonts w:ascii="Arial" w:hAnsi="Arial"/>
@@ -2850,6 +3140,9 @@
             <w:shd w:val="clear" w:color="auto" w:fill="C25600"/>
           </w:tcPr>
           <w:p>
+            <w:pPr>
+              <w:keepNext/>
+            </w:pPr>
             <w:r>
               <w:rPr>
                 <w:rFonts w:ascii="Arial" w:hAnsi="Arial"/>
@@ -2867,6 +3160,9 @@
             <w:shd w:val="clear" w:color="auto" w:fill="C25600"/>
           </w:tcPr>
           <w:p>
+            <w:pPr>
+              <w:keepNext/>
+            </w:pPr>
             <w:r>
               <w:rPr>
                 <w:rFonts w:ascii="Arial" w:hAnsi="Arial"/>
@@ -2880,11 +3176,17 @@
         </w:tc>
       </w:tr>
       <w:tr>
+        <w:trPr>
+          <w:cantSplit/>
+        </w:trPr>
         <w:tc>
           <w:tcPr>
             <w:tcW w:type="dxa" w:w="1728"/>
           </w:tcPr>
           <w:p>
+            <w:pPr>
+              <w:keepNext/>
+            </w:pPr>
             <w:r>
               <w:rPr>
                 <w:rFonts w:ascii="Arial" w:hAnsi="Arial"/>
@@ -2899,6 +3201,9 @@
             <w:tcW w:type="dxa" w:w="1728"/>
           </w:tcPr>
           <w:p>
+            <w:pPr>
+              <w:keepNext/>
+            </w:pPr>
             <w:r>
               <w:rPr>
                 <w:rFonts w:ascii="Arial" w:hAnsi="Arial"/>
@@ -2913,12 +3218,366 @@
             <w:tcW w:type="dxa" w:w="1728"/>
           </w:tcPr>
           <w:p>
+            <w:pPr>
+              <w:keepNext/>
+            </w:pPr>
             <w:r>
               <w:rPr>
                 <w:rFonts w:ascii="Arial" w:hAnsi="Arial"/>
                 <w:sz w:val="20"/>
               </w:rPr>
               <w:t>SOIC-16</w:t>
+            </w:r>
+          </w:p>
+        </w:tc>
+        <w:tc>
+          <w:tcPr>
+            <w:tcW w:type="dxa" w:w="1728"/>
+          </w:tcPr>
+          <w:p>
+            <w:pPr>
+              <w:keepNext/>
+            </w:pPr>
+            <w:r>
+              <w:rPr>
+                <w:rFonts w:ascii="Arial" w:hAnsi="Arial"/>
+                <w:sz w:val="20"/>
+              </w:rPr>
+              <w:t>1</w:t>
+            </w:r>
+          </w:p>
+        </w:tc>
+        <w:tc>
+          <w:tcPr>
+            <w:tcW w:type="dxa" w:w="1728"/>
+          </w:tcPr>
+          <w:p>
+            <w:pPr>
+              <w:keepNext/>
+            </w:pPr>
+            <w:r>
+              <w:rPr>
+                <w:rFonts w:ascii="Arial" w:hAnsi="Arial"/>
+                <w:sz w:val="20"/>
+              </w:rPr>
+              <w:t>TCXO real-time clock (±2 ppm), battery-backed</w:t>
+            </w:r>
+          </w:p>
+        </w:tc>
+      </w:tr>
+      <w:tr>
+        <w:trPr>
+          <w:cantSplit/>
+        </w:trPr>
+        <w:tc>
+          <w:tcPr>
+            <w:tcW w:type="dxa" w:w="1728"/>
+          </w:tcPr>
+          <w:p>
+            <w:pPr>
+              <w:keepNext/>
+            </w:pPr>
+            <w:r>
+              <w:rPr>
+                <w:rFonts w:ascii="Arial" w:hAnsi="Arial"/>
+                <w:sz w:val="20"/>
+              </w:rPr>
+              <w:t>U2</w:t>
+            </w:r>
+          </w:p>
+        </w:tc>
+        <w:tc>
+          <w:tcPr>
+            <w:tcW w:type="dxa" w:w="1728"/>
+          </w:tcPr>
+          <w:p>
+            <w:pPr>
+              <w:keepNext/>
+            </w:pPr>
+            <w:r>
+              <w:rPr>
+                <w:rFonts w:ascii="Arial" w:hAnsi="Arial"/>
+                <w:sz w:val="20"/>
+              </w:rPr>
+              <w:t>74HCT14</w:t>
+            </w:r>
+          </w:p>
+        </w:tc>
+        <w:tc>
+          <w:tcPr>
+            <w:tcW w:type="dxa" w:w="1728"/>
+          </w:tcPr>
+          <w:p>
+            <w:pPr>
+              <w:keepNext/>
+            </w:pPr>
+            <w:r>
+              <w:rPr>
+                <w:rFonts w:ascii="Arial" w:hAnsi="Arial"/>
+                <w:sz w:val="20"/>
+              </w:rPr>
+              <w:t>SOIC-14</w:t>
+            </w:r>
+          </w:p>
+        </w:tc>
+        <w:tc>
+          <w:tcPr>
+            <w:tcW w:type="dxa" w:w="1728"/>
+          </w:tcPr>
+          <w:p>
+            <w:pPr>
+              <w:keepNext/>
+            </w:pPr>
+            <w:r>
+              <w:rPr>
+                <w:rFonts w:ascii="Arial" w:hAnsi="Arial"/>
+                <w:sz w:val="20"/>
+              </w:rPr>
+              <w:t>1</w:t>
+            </w:r>
+          </w:p>
+        </w:tc>
+        <w:tc>
+          <w:tcPr>
+            <w:tcW w:type="dxa" w:w="1728"/>
+          </w:tcPr>
+          <w:p>
+            <w:pPr>
+              <w:keepNext/>
+            </w:pPr>
+            <w:r>
+              <w:rPr>
+                <w:rFonts w:ascii="Arial" w:hAnsi="Arial"/>
+                <w:sz w:val="20"/>
+              </w:rPr>
+              <w:t>Hex inverting Schmitt trigger — 3.3 V→5 V level shifter for the APA102 string</w:t>
+            </w:r>
+          </w:p>
+        </w:tc>
+      </w:tr>
+      <w:tr>
+        <w:trPr>
+          <w:cantSplit/>
+        </w:trPr>
+        <w:tc>
+          <w:tcPr>
+            <w:tcW w:type="dxa" w:w="1728"/>
+          </w:tcPr>
+          <w:p>
+            <w:pPr>
+              <w:keepNext/>
+            </w:pPr>
+            <w:r>
+              <w:rPr>
+                <w:rFonts w:ascii="Arial" w:hAnsi="Arial"/>
+                <w:sz w:val="20"/>
+              </w:rPr>
+              <w:t>U3</w:t>
+            </w:r>
+          </w:p>
+        </w:tc>
+        <w:tc>
+          <w:tcPr>
+            <w:tcW w:type="dxa" w:w="1728"/>
+          </w:tcPr>
+          <w:p>
+            <w:pPr>
+              <w:keepNext/>
+            </w:pPr>
+            <w:r>
+              <w:rPr>
+                <w:rFonts w:ascii="Arial" w:hAnsi="Arial"/>
+                <w:sz w:val="20"/>
+              </w:rPr>
+              <w:t>AP2112K-3.3</w:t>
+            </w:r>
+          </w:p>
+        </w:tc>
+        <w:tc>
+          <w:tcPr>
+            <w:tcW w:type="dxa" w:w="1728"/>
+          </w:tcPr>
+          <w:p>
+            <w:pPr>
+              <w:keepNext/>
+            </w:pPr>
+            <w:r>
+              <w:rPr>
+                <w:rFonts w:ascii="Arial" w:hAnsi="Arial"/>
+                <w:sz w:val="20"/>
+              </w:rPr>
+              <w:t>SOT-23-5</w:t>
+            </w:r>
+          </w:p>
+        </w:tc>
+        <w:tc>
+          <w:tcPr>
+            <w:tcW w:type="dxa" w:w="1728"/>
+          </w:tcPr>
+          <w:p>
+            <w:pPr>
+              <w:keepNext/>
+            </w:pPr>
+            <w:r>
+              <w:rPr>
+                <w:rFonts w:ascii="Arial" w:hAnsi="Arial"/>
+                <w:sz w:val="20"/>
+              </w:rPr>
+              <w:t>1</w:t>
+            </w:r>
+          </w:p>
+        </w:tc>
+        <w:tc>
+          <w:tcPr>
+            <w:tcW w:type="dxa" w:w="1728"/>
+          </w:tcPr>
+          <w:p>
+            <w:pPr>
+              <w:keepNext/>
+            </w:pPr>
+            <w:r>
+              <w:rPr>
+                <w:rFonts w:ascii="Arial" w:hAnsi="Arial"/>
+                <w:sz w:val="20"/>
+              </w:rPr>
+              <w:t>3.3 V LDO regulator</w:t>
+            </w:r>
+          </w:p>
+        </w:tc>
+      </w:tr>
+      <w:tr>
+        <w:trPr>
+          <w:cantSplit/>
+        </w:trPr>
+        <w:tc>
+          <w:tcPr>
+            <w:tcW w:type="dxa" w:w="1728"/>
+          </w:tcPr>
+          <w:p>
+            <w:pPr>
+              <w:keepNext/>
+            </w:pPr>
+            <w:r>
+              <w:rPr>
+                <w:rFonts w:ascii="Arial" w:hAnsi="Arial"/>
+                <w:sz w:val="20"/>
+              </w:rPr>
+              <w:t>D1</w:t>
+            </w:r>
+          </w:p>
+        </w:tc>
+        <w:tc>
+          <w:tcPr>
+            <w:tcW w:type="dxa" w:w="1728"/>
+          </w:tcPr>
+          <w:p>
+            <w:pPr>
+              <w:keepNext/>
+            </w:pPr>
+            <w:r>
+              <w:rPr>
+                <w:rFonts w:ascii="Arial" w:hAnsi="Arial"/>
+                <w:sz w:val="20"/>
+              </w:rPr>
+              <w:t>CDBM-140G</w:t>
+            </w:r>
+          </w:p>
+        </w:tc>
+        <w:tc>
+          <w:tcPr>
+            <w:tcW w:type="dxa" w:w="1728"/>
+          </w:tcPr>
+          <w:p>
+            <w:pPr>
+              <w:keepNext/>
+            </w:pPr>
+            <w:r>
+              <w:rPr>
+                <w:rFonts w:ascii="Arial" w:hAnsi="Arial"/>
+                <w:sz w:val="20"/>
+              </w:rPr>
+              <w:t>SOD-123F</w:t>
+            </w:r>
+          </w:p>
+        </w:tc>
+        <w:tc>
+          <w:tcPr>
+            <w:tcW w:type="dxa" w:w="1728"/>
+          </w:tcPr>
+          <w:p>
+            <w:pPr>
+              <w:keepNext/>
+            </w:pPr>
+            <w:r>
+              <w:rPr>
+                <w:rFonts w:ascii="Arial" w:hAnsi="Arial"/>
+                <w:sz w:val="20"/>
+              </w:rPr>
+              <w:t>1</w:t>
+            </w:r>
+          </w:p>
+        </w:tc>
+        <w:tc>
+          <w:tcPr>
+            <w:tcW w:type="dxa" w:w="1728"/>
+          </w:tcPr>
+          <w:p>
+            <w:pPr>
+              <w:keepNext/>
+            </w:pPr>
+            <w:r>
+              <w:rPr>
+                <w:rFonts w:ascii="Arial" w:hAnsi="Arial"/>
+                <w:sz w:val="20"/>
+              </w:rPr>
+              <w:t>Schottky input-protection diode</w:t>
+            </w:r>
+          </w:p>
+        </w:tc>
+      </w:tr>
+      <w:tr>
+        <w:trPr>
+          <w:cantSplit/>
+        </w:trPr>
+        <w:tc>
+          <w:tcPr>
+            <w:tcW w:type="dxa" w:w="1728"/>
+          </w:tcPr>
+          <w:p>
+            <w:r>
+              <w:rPr>
+                <w:rFonts w:ascii="Arial" w:hAnsi="Arial"/>
+                <w:sz w:val="20"/>
+              </w:rPr>
+              <w:t>FB</w:t>
+            </w:r>
+          </w:p>
+        </w:tc>
+        <w:tc>
+          <w:tcPr>
+            <w:tcW w:type="dxa" w:w="1728"/>
+          </w:tcPr>
+          <w:p>
+            <w:r>
+              <w:rPr>
+                <w:rFonts w:ascii="Arial" w:hAnsi="Arial"/>
+                <w:sz w:val="20"/>
+              </w:rPr>
+              <w:t>Würth 74279218</w:t>
+            </w:r>
+          </w:p>
+        </w:tc>
+        <w:tc>
+          <w:tcPr>
+            <w:tcW w:type="dxa" w:w="1728"/>
+          </w:tcPr>
+          <w:p>
+            <w:r>
+              <w:rPr>
+                <w:rFonts w:ascii="Arial" w:hAnsi="Arial"/>
+                <w:sz w:val="20"/>
+              </w:rPr>
+              <w:t>0805</w:t>
             </w:r>
           </w:p>
         </w:tc>
@@ -2946,223 +3605,7 @@
                 <w:rFonts w:ascii="Arial" w:hAnsi="Arial"/>
                 <w:sz w:val="20"/>
               </w:rPr>
-              <w:t>TCXO real-time clock (±2 ppm), battery-backed</w:t>
-            </w:r>
-          </w:p>
-        </w:tc>
-      </w:tr>
-      <w:tr>
-        <w:tc>
-          <w:tcPr>
-            <w:tcW w:type="dxa" w:w="1728"/>
-          </w:tcPr>
-          <w:p>
-            <w:r>
-              <w:rPr>
-                <w:rFonts w:ascii="Arial" w:hAnsi="Arial"/>
-                <w:sz w:val="20"/>
-              </w:rPr>
-              <w:t>U2</w:t>
-            </w:r>
-          </w:p>
-        </w:tc>
-        <w:tc>
-          <w:tcPr>
-            <w:tcW w:type="dxa" w:w="1728"/>
-          </w:tcPr>
-          <w:p>
-            <w:r>
-              <w:rPr>
-                <w:rFonts w:ascii="Arial" w:hAnsi="Arial"/>
-                <w:sz w:val="20"/>
-              </w:rPr>
-              <w:t>74HCT14</w:t>
-            </w:r>
-          </w:p>
-        </w:tc>
-        <w:tc>
-          <w:tcPr>
-            <w:tcW w:type="dxa" w:w="1728"/>
-          </w:tcPr>
-          <w:p>
-            <w:r>
-              <w:rPr>
-                <w:rFonts w:ascii="Arial" w:hAnsi="Arial"/>
-                <w:sz w:val="20"/>
-              </w:rPr>
-              <w:t>SOIC-14</w:t>
-            </w:r>
-          </w:p>
-        </w:tc>
-        <w:tc>
-          <w:tcPr>
-            <w:tcW w:type="dxa" w:w="1728"/>
-          </w:tcPr>
-          <w:p>
-            <w:r>
-              <w:rPr>
-                <w:rFonts w:ascii="Arial" w:hAnsi="Arial"/>
-                <w:sz w:val="20"/>
-              </w:rPr>
-              <w:t>1</w:t>
-            </w:r>
-          </w:p>
-        </w:tc>
-        <w:tc>
-          <w:tcPr>
-            <w:tcW w:type="dxa" w:w="1728"/>
-          </w:tcPr>
-          <w:p>
-            <w:r>
-              <w:rPr>
-                <w:rFonts w:ascii="Arial" w:hAnsi="Arial"/>
-                <w:sz w:val="20"/>
-              </w:rPr>
-              <w:t>Hex inverting Schmitt trigger — 3.3 V→5 V level shifter for the APA102 string</w:t>
-            </w:r>
-          </w:p>
-        </w:tc>
-      </w:tr>
-      <w:tr>
-        <w:tc>
-          <w:tcPr>
-            <w:tcW w:type="dxa" w:w="1728"/>
-          </w:tcPr>
-          <w:p>
-            <w:r>
-              <w:rPr>
-                <w:rFonts w:ascii="Arial" w:hAnsi="Arial"/>
-                <w:sz w:val="20"/>
-              </w:rPr>
-              <w:t>U3</w:t>
-            </w:r>
-          </w:p>
-        </w:tc>
-        <w:tc>
-          <w:tcPr>
-            <w:tcW w:type="dxa" w:w="1728"/>
-          </w:tcPr>
-          <w:p>
-            <w:r>
-              <w:rPr>
-                <w:rFonts w:ascii="Arial" w:hAnsi="Arial"/>
-                <w:sz w:val="20"/>
-              </w:rPr>
-              <w:t>AP2112K-3.3</w:t>
-            </w:r>
-          </w:p>
-        </w:tc>
-        <w:tc>
-          <w:tcPr>
-            <w:tcW w:type="dxa" w:w="1728"/>
-          </w:tcPr>
-          <w:p>
-            <w:r>
-              <w:rPr>
-                <w:rFonts w:ascii="Arial" w:hAnsi="Arial"/>
-                <w:sz w:val="20"/>
-              </w:rPr>
-              <w:t>SOT-23-5</w:t>
-            </w:r>
-          </w:p>
-        </w:tc>
-        <w:tc>
-          <w:tcPr>
-            <w:tcW w:type="dxa" w:w="1728"/>
-          </w:tcPr>
-          <w:p>
-            <w:r>
-              <w:rPr>
-                <w:rFonts w:ascii="Arial" w:hAnsi="Arial"/>
-                <w:sz w:val="20"/>
-              </w:rPr>
-              <w:t>1</w:t>
-            </w:r>
-          </w:p>
-        </w:tc>
-        <w:tc>
-          <w:tcPr>
-            <w:tcW w:type="dxa" w:w="1728"/>
-          </w:tcPr>
-          <w:p>
-            <w:r>
-              <w:rPr>
-                <w:rFonts w:ascii="Arial" w:hAnsi="Arial"/>
-                <w:sz w:val="20"/>
-              </w:rPr>
-              <w:t>3.3 V LDO regulator</w:t>
-            </w:r>
-          </w:p>
-        </w:tc>
-      </w:tr>
-      <w:tr>
-        <w:tc>
-          <w:tcPr>
-            <w:tcW w:type="dxa" w:w="1728"/>
-          </w:tcPr>
-          <w:p>
-            <w:r>
-              <w:rPr>
-                <w:rFonts w:ascii="Arial" w:hAnsi="Arial"/>
-                <w:sz w:val="20"/>
-              </w:rPr>
-              <w:t>D1</w:t>
-            </w:r>
-          </w:p>
-        </w:tc>
-        <w:tc>
-          <w:tcPr>
-            <w:tcW w:type="dxa" w:w="1728"/>
-          </w:tcPr>
-          <w:p>
-            <w:r>
-              <w:rPr>
-                <w:rFonts w:ascii="Arial" w:hAnsi="Arial"/>
-                <w:sz w:val="20"/>
-              </w:rPr>
-              <w:t>CDBM-140G</w:t>
-            </w:r>
-          </w:p>
-        </w:tc>
-        <w:tc>
-          <w:tcPr>
-            <w:tcW w:type="dxa" w:w="1728"/>
-          </w:tcPr>
-          <w:p>
-            <w:r>
-              <w:rPr>
-                <w:rFonts w:ascii="Arial" w:hAnsi="Arial"/>
-                <w:sz w:val="20"/>
-              </w:rPr>
-              <w:t>SOD-123F</w:t>
-            </w:r>
-          </w:p>
-        </w:tc>
-        <w:tc>
-          <w:tcPr>
-            <w:tcW w:type="dxa" w:w="1728"/>
-          </w:tcPr>
-          <w:p>
-            <w:r>
-              <w:rPr>
-                <w:rFonts w:ascii="Arial" w:hAnsi="Arial"/>
-                <w:sz w:val="20"/>
-              </w:rPr>
-              <w:t>1</w:t>
-            </w:r>
-          </w:p>
-        </w:tc>
-        <w:tc>
-          <w:tcPr>
-            <w:tcW w:type="dxa" w:w="1728"/>
-          </w:tcPr>
-          <w:p>
-            <w:r>
-              <w:rPr>
-                <w:rFonts w:ascii="Arial" w:hAnsi="Arial"/>
-                <w:sz w:val="20"/>
-              </w:rPr>
-              <w:t>Schottky input-protection diode</w:t>
+              <w:t>Ferrite bead — isolates the GPS receiver supply from the 3.3 V rail</w:t>
             </w:r>
           </w:p>
         </w:tc>
@@ -3197,12 +3640,18 @@
         <w:gridCol w:w="2160"/>
       </w:tblGrid>
       <w:tr>
+        <w:trPr>
+          <w:cantSplit/>
+        </w:trPr>
         <w:tc>
           <w:tcPr>
             <w:tcW w:type="dxa" w:w="2160"/>
             <w:shd w:val="clear" w:color="auto" w:fill="C25600"/>
           </w:tcPr>
           <w:p>
+            <w:pPr>
+              <w:keepNext/>
+            </w:pPr>
             <w:r>
               <w:rPr>
                 <w:rFonts w:ascii="Arial" w:hAnsi="Arial"/>
@@ -3220,6 +3669,9 @@
             <w:shd w:val="clear" w:color="auto" w:fill="C25600"/>
           </w:tcPr>
           <w:p>
+            <w:pPr>
+              <w:keepNext/>
+            </w:pPr>
             <w:r>
               <w:rPr>
                 <w:rFonts w:ascii="Arial" w:hAnsi="Arial"/>
@@ -3237,6 +3689,9 @@
             <w:shd w:val="clear" w:color="auto" w:fill="C25600"/>
           </w:tcPr>
           <w:p>
+            <w:pPr>
+              <w:keepNext/>
+            </w:pPr>
             <w:r>
               <w:rPr>
                 <w:rFonts w:ascii="Arial" w:hAnsi="Arial"/>
@@ -3254,6 +3709,9 @@
             <w:shd w:val="clear" w:color="auto" w:fill="C25600"/>
           </w:tcPr>
           <w:p>
+            <w:pPr>
+              <w:keepNext/>
+            </w:pPr>
             <w:r>
               <w:rPr>
                 <w:rFonts w:ascii="Arial" w:hAnsi="Arial"/>
@@ -3267,11 +3725,17 @@
         </w:tc>
       </w:tr>
       <w:tr>
+        <w:trPr>
+          <w:cantSplit/>
+        </w:trPr>
         <w:tc>
           <w:tcPr>
             <w:tcW w:type="dxa" w:w="2160"/>
           </w:tcPr>
           <w:p>
+            <w:pPr>
+              <w:keepNext/>
+            </w:pPr>
             <w:r>
               <w:rPr>
                 <w:rFonts w:ascii="Arial" w:hAnsi="Arial"/>
@@ -3286,6 +3750,9 @@
             <w:tcW w:type="dxa" w:w="2160"/>
           </w:tcPr>
           <w:p>
+            <w:pPr>
+              <w:keepNext/>
+            </w:pPr>
             <w:r>
               <w:rPr>
                 <w:rFonts w:ascii="Arial" w:hAnsi="Arial"/>
@@ -3300,6 +3767,9 @@
             <w:tcW w:type="dxa" w:w="2160"/>
           </w:tcPr>
           <w:p>
+            <w:pPr>
+              <w:keepNext/>
+            </w:pPr>
             <w:r>
               <w:rPr>
                 <w:rFonts w:ascii="Arial" w:hAnsi="Arial"/>
@@ -3314,6 +3784,9 @@
             <w:tcW w:type="dxa" w:w="2160"/>
           </w:tcPr>
           <w:p>
+            <w:pPr>
+              <w:keepNext/>
+            </w:pPr>
             <w:r>
               <w:rPr>
                 <w:rFonts w:ascii="Arial" w:hAnsi="Arial"/>
@@ -3325,6 +3798,9 @@
         </w:tc>
       </w:tr>
       <w:tr>
+        <w:trPr>
+          <w:cantSplit/>
+        </w:trPr>
         <w:tc>
           <w:tcPr>
             <w:tcW w:type="dxa" w:w="2160"/>
@@ -3412,12 +3888,18 @@
         <w:gridCol w:w="2160"/>
       </w:tblGrid>
       <w:tr>
+        <w:trPr>
+          <w:cantSplit/>
+        </w:trPr>
         <w:tc>
           <w:tcPr>
             <w:tcW w:type="dxa" w:w="2160"/>
             <w:shd w:val="clear" w:color="auto" w:fill="C25600"/>
           </w:tcPr>
           <w:p>
+            <w:pPr>
+              <w:keepNext/>
+            </w:pPr>
             <w:r>
               <w:rPr>
                 <w:rFonts w:ascii="Arial" w:hAnsi="Arial"/>
@@ -3435,6 +3917,9 @@
             <w:shd w:val="clear" w:color="auto" w:fill="C25600"/>
           </w:tcPr>
           <w:p>
+            <w:pPr>
+              <w:keepNext/>
+            </w:pPr>
             <w:r>
               <w:rPr>
                 <w:rFonts w:ascii="Arial" w:hAnsi="Arial"/>
@@ -3452,6 +3937,9 @@
             <w:shd w:val="clear" w:color="auto" w:fill="C25600"/>
           </w:tcPr>
           <w:p>
+            <w:pPr>
+              <w:keepNext/>
+            </w:pPr>
             <w:r>
               <w:rPr>
                 <w:rFonts w:ascii="Arial" w:hAnsi="Arial"/>
@@ -3469,6 +3957,9 @@
             <w:shd w:val="clear" w:color="auto" w:fill="C25600"/>
           </w:tcPr>
           <w:p>
+            <w:pPr>
+              <w:keepNext/>
+            </w:pPr>
             <w:r>
               <w:rPr>
                 <w:rFonts w:ascii="Arial" w:hAnsi="Arial"/>
@@ -3482,17 +3973,23 @@
         </w:tc>
       </w:tr>
       <w:tr>
+        <w:trPr>
+          <w:cantSplit/>
+        </w:trPr>
         <w:tc>
           <w:tcPr>
             <w:tcW w:type="dxa" w:w="2160"/>
           </w:tcPr>
           <w:p>
+            <w:pPr>
+              <w:keepNext/>
+            </w:pPr>
             <w:r>
               <w:rPr>
                 <w:rFonts w:ascii="Arial" w:hAnsi="Arial"/>
                 <w:sz w:val="20"/>
               </w:rPr>
-              <w:t>R1, R4, R7</w:t>
+              <w:t>R1</w:t>
             </w:r>
           </w:p>
         </w:tc>
@@ -3501,6 +3998,9 @@
             <w:tcW w:type="dxa" w:w="2160"/>
           </w:tcPr>
           <w:p>
+            <w:pPr>
+              <w:keepNext/>
+            </w:pPr>
             <w:r>
               <w:rPr>
                 <w:rFonts w:ascii="Arial" w:hAnsi="Arial"/>
@@ -3515,12 +4015,15 @@
             <w:tcW w:type="dxa" w:w="2160"/>
           </w:tcPr>
           <w:p>
+            <w:pPr>
+              <w:keepNext/>
+            </w:pPr>
             <w:r>
               <w:rPr>
                 <w:rFonts w:ascii="Arial" w:hAnsi="Arial"/>
                 <w:sz w:val="20"/>
               </w:rPr>
-              <w:t>3</w:t>
+              <w:t>1</w:t>
             </w:r>
           </w:p>
         </w:tc>
@@ -3529,22 +4032,250 @@
             <w:tcW w:type="dxa" w:w="2160"/>
           </w:tcPr>
           <w:p>
+            <w:pPr>
+              <w:keepNext/>
+            </w:pPr>
             <w:r>
               <w:rPr>
                 <w:rFonts w:ascii="Arial" w:hAnsi="Arial"/>
                 <w:sz w:val="20"/>
               </w:rPr>
-              <w:t>Pull-ups (incl. DS3231 ~RST / GPS reset via R1)</w:t>
+              <w:t>DS3231 ~RST pull-up (not driven by the MCU)</w:t>
             </w:r>
           </w:p>
         </w:tc>
       </w:tr>
       <w:tr>
+        <w:trPr>
+          <w:cantSplit/>
+        </w:trPr>
         <w:tc>
           <w:tcPr>
             <w:tcW w:type="dxa" w:w="2160"/>
           </w:tcPr>
           <w:p>
+            <w:pPr>
+              <w:keepNext/>
+            </w:pPr>
+            <w:r>
+              <w:rPr>
+                <w:rFonts w:ascii="Arial" w:hAnsi="Arial"/>
+                <w:sz w:val="20"/>
+              </w:rPr>
+              <w:t>R4</w:t>
+            </w:r>
+          </w:p>
+        </w:tc>
+        <w:tc>
+          <w:tcPr>
+            <w:tcW w:type="dxa" w:w="2160"/>
+          </w:tcPr>
+          <w:p>
+            <w:pPr>
+              <w:keepNext/>
+            </w:pPr>
+            <w:r>
+              <w:rPr>
+                <w:rFonts w:ascii="Arial" w:hAnsi="Arial"/>
+                <w:sz w:val="20"/>
+              </w:rPr>
+              <w:t>10k</w:t>
+            </w:r>
+          </w:p>
+        </w:tc>
+        <w:tc>
+          <w:tcPr>
+            <w:tcW w:type="dxa" w:w="2160"/>
+          </w:tcPr>
+          <w:p>
+            <w:pPr>
+              <w:keepNext/>
+            </w:pPr>
+            <w:r>
+              <w:rPr>
+                <w:rFonts w:ascii="Arial" w:hAnsi="Arial"/>
+                <w:sz w:val="20"/>
+              </w:rPr>
+              <w:t>1</w:t>
+            </w:r>
+          </w:p>
+        </w:tc>
+        <w:tc>
+          <w:tcPr>
+            <w:tcW w:type="dxa" w:w="2160"/>
+          </w:tcPr>
+          <w:p>
+            <w:pPr>
+              <w:keepNext/>
+            </w:pPr>
+            <w:r>
+              <w:rPr>
+                <w:rFonts w:ascii="Arial" w:hAnsi="Arial"/>
+                <w:sz w:val="20"/>
+              </w:rPr>
+              <w:t>ESP32-S3 EN (reset) pull-up</w:t>
+            </w:r>
+          </w:p>
+        </w:tc>
+      </w:tr>
+      <w:tr>
+        <w:trPr>
+          <w:cantSplit/>
+        </w:trPr>
+        <w:tc>
+          <w:tcPr>
+            <w:tcW w:type="dxa" w:w="2160"/>
+          </w:tcPr>
+          <w:p>
+            <w:pPr>
+              <w:keepNext/>
+            </w:pPr>
+            <w:r>
+              <w:rPr>
+                <w:rFonts w:ascii="Arial" w:hAnsi="Arial"/>
+                <w:sz w:val="20"/>
+              </w:rPr>
+              <w:t>R7</w:t>
+            </w:r>
+          </w:p>
+        </w:tc>
+        <w:tc>
+          <w:tcPr>
+            <w:tcW w:type="dxa" w:w="2160"/>
+          </w:tcPr>
+          <w:p>
+            <w:pPr>
+              <w:keepNext/>
+            </w:pPr>
+            <w:r>
+              <w:rPr>
+                <w:rFonts w:ascii="Arial" w:hAnsi="Arial"/>
+                <w:sz w:val="20"/>
+              </w:rPr>
+              <w:t>10k</w:t>
+            </w:r>
+          </w:p>
+        </w:tc>
+        <w:tc>
+          <w:tcPr>
+            <w:tcW w:type="dxa" w:w="2160"/>
+          </w:tcPr>
+          <w:p>
+            <w:pPr>
+              <w:keepNext/>
+            </w:pPr>
+            <w:r>
+              <w:rPr>
+                <w:rFonts w:ascii="Arial" w:hAnsi="Arial"/>
+                <w:sz w:val="20"/>
+              </w:rPr>
+              <w:t>1</w:t>
+            </w:r>
+          </w:p>
+        </w:tc>
+        <w:tc>
+          <w:tcPr>
+            <w:tcW w:type="dxa" w:w="2160"/>
+          </w:tcPr>
+          <w:p>
+            <w:pPr>
+              <w:keepNext/>
+            </w:pPr>
+            <w:r>
+              <w:rPr>
+                <w:rFonts w:ascii="Arial" w:hAnsi="Arial"/>
+                <w:sz w:val="20"/>
+              </w:rPr>
+              <w:t>ESP32-S3 IO0 (boot mode) pull-up</w:t>
+            </w:r>
+          </w:p>
+        </w:tc>
+      </w:tr>
+      <w:tr>
+        <w:trPr>
+          <w:cantSplit/>
+        </w:trPr>
+        <w:tc>
+          <w:tcPr>
+            <w:tcW w:type="dxa" w:w="2160"/>
+          </w:tcPr>
+          <w:p>
+            <w:pPr>
+              <w:keepNext/>
+            </w:pPr>
+            <w:r>
+              <w:rPr>
+                <w:rFonts w:ascii="Arial" w:hAnsi="Arial"/>
+                <w:sz w:val="20"/>
+              </w:rPr>
+              <w:t>R10</w:t>
+            </w:r>
+          </w:p>
+        </w:tc>
+        <w:tc>
+          <w:tcPr>
+            <w:tcW w:type="dxa" w:w="2160"/>
+          </w:tcPr>
+          <w:p>
+            <w:pPr>
+              <w:keepNext/>
+            </w:pPr>
+            <w:r>
+              <w:rPr>
+                <w:rFonts w:ascii="Arial" w:hAnsi="Arial"/>
+                <w:sz w:val="20"/>
+              </w:rPr>
+              <w:t>10k</w:t>
+            </w:r>
+          </w:p>
+        </w:tc>
+        <w:tc>
+          <w:tcPr>
+            <w:tcW w:type="dxa" w:w="2160"/>
+          </w:tcPr>
+          <w:p>
+            <w:pPr>
+              <w:keepNext/>
+            </w:pPr>
+            <w:r>
+              <w:rPr>
+                <w:rFonts w:ascii="Arial" w:hAnsi="Arial"/>
+                <w:sz w:val="20"/>
+              </w:rPr>
+              <w:t>1</w:t>
+            </w:r>
+          </w:p>
+        </w:tc>
+        <w:tc>
+          <w:tcPr>
+            <w:tcW w:type="dxa" w:w="2160"/>
+          </w:tcPr>
+          <w:p>
+            <w:pPr>
+              <w:keepNext/>
+            </w:pPr>
+            <w:r>
+              <w:rPr>
+                <w:rFonts w:ascii="Arial" w:hAnsi="Arial"/>
+                <w:sz w:val="20"/>
+              </w:rPr>
+              <w:t>GPS RESET_N pull-up to the GPS supply</w:t>
+            </w:r>
+          </w:p>
+        </w:tc>
+      </w:tr>
+      <w:tr>
+        <w:trPr>
+          <w:cantSplit/>
+        </w:trPr>
+        <w:tc>
+          <w:tcPr>
+            <w:tcW w:type="dxa" w:w="2160"/>
+          </w:tcPr>
+          <w:p>
+            <w:pPr>
+              <w:keepNext/>
+            </w:pPr>
             <w:r>
               <w:rPr>
                 <w:rFonts w:ascii="Arial" w:hAnsi="Arial"/>
@@ -3559,6 +4290,9 @@
             <w:tcW w:type="dxa" w:w="2160"/>
           </w:tcPr>
           <w:p>
+            <w:pPr>
+              <w:keepNext/>
+            </w:pPr>
             <w:r>
               <w:rPr>
                 <w:rFonts w:ascii="Arial" w:hAnsi="Arial"/>
@@ -3573,6 +4307,9 @@
             <w:tcW w:type="dxa" w:w="2160"/>
           </w:tcPr>
           <w:p>
+            <w:pPr>
+              <w:keepNext/>
+            </w:pPr>
             <w:r>
               <w:rPr>
                 <w:rFonts w:ascii="Arial" w:hAnsi="Arial"/>
@@ -3587,6 +4324,9 @@
             <w:tcW w:type="dxa" w:w="2160"/>
           </w:tcPr>
           <w:p>
+            <w:pPr>
+              <w:keepNext/>
+            </w:pPr>
             <w:r>
               <w:rPr>
                 <w:rFonts w:ascii="Arial" w:hAnsi="Arial"/>
@@ -3598,11 +4338,17 @@
         </w:tc>
       </w:tr>
       <w:tr>
+        <w:trPr>
+          <w:cantSplit/>
+        </w:trPr>
         <w:tc>
           <w:tcPr>
             <w:tcW w:type="dxa" w:w="2160"/>
           </w:tcPr>
           <w:p>
+            <w:pPr>
+              <w:keepNext/>
+            </w:pPr>
             <w:r>
               <w:rPr>
                 <w:rFonts w:ascii="Arial" w:hAnsi="Arial"/>
@@ -3617,6 +4363,9 @@
             <w:tcW w:type="dxa" w:w="2160"/>
           </w:tcPr>
           <w:p>
+            <w:pPr>
+              <w:keepNext/>
+            </w:pPr>
             <w:r>
               <w:rPr>
                 <w:rFonts w:ascii="Arial" w:hAnsi="Arial"/>
@@ -3631,6 +4380,9 @@
             <w:tcW w:type="dxa" w:w="2160"/>
           </w:tcPr>
           <w:p>
+            <w:pPr>
+              <w:keepNext/>
+            </w:pPr>
             <w:r>
               <w:rPr>
                 <w:rFonts w:ascii="Arial" w:hAnsi="Arial"/>
@@ -3645,6 +4397,9 @@
             <w:tcW w:type="dxa" w:w="2160"/>
           </w:tcPr>
           <w:p>
+            <w:pPr>
+              <w:keepNext/>
+            </w:pPr>
             <w:r>
               <w:rPr>
                 <w:rFonts w:ascii="Arial" w:hAnsi="Arial"/>
@@ -3656,6 +4411,9 @@
         </w:tc>
       </w:tr>
       <w:tr>
+        <w:trPr>
+          <w:cantSplit/>
+        </w:trPr>
         <w:tc>
           <w:tcPr>
             <w:tcW w:type="dxa" w:w="2160"/>
@@ -3743,12 +4501,18 @@
         <w:gridCol w:w="2160"/>
       </w:tblGrid>
       <w:tr>
+        <w:trPr>
+          <w:cantSplit/>
+        </w:trPr>
         <w:tc>
           <w:tcPr>
             <w:tcW w:type="dxa" w:w="2160"/>
             <w:shd w:val="clear" w:color="auto" w:fill="C25600"/>
           </w:tcPr>
           <w:p>
+            <w:pPr>
+              <w:keepNext/>
+            </w:pPr>
             <w:r>
               <w:rPr>
                 <w:rFonts w:ascii="Arial" w:hAnsi="Arial"/>
@@ -3766,6 +4530,9 @@
             <w:shd w:val="clear" w:color="auto" w:fill="C25600"/>
           </w:tcPr>
           <w:p>
+            <w:pPr>
+              <w:keepNext/>
+            </w:pPr>
             <w:r>
               <w:rPr>
                 <w:rFonts w:ascii="Arial" w:hAnsi="Arial"/>
@@ -3783,6 +4550,9 @@
             <w:shd w:val="clear" w:color="auto" w:fill="C25600"/>
           </w:tcPr>
           <w:p>
+            <w:pPr>
+              <w:keepNext/>
+            </w:pPr>
             <w:r>
               <w:rPr>
                 <w:rFonts w:ascii="Arial" w:hAnsi="Arial"/>
@@ -3800,6 +4570,9 @@
             <w:shd w:val="clear" w:color="auto" w:fill="C25600"/>
           </w:tcPr>
           <w:p>
+            <w:pPr>
+              <w:keepNext/>
+            </w:pPr>
             <w:r>
               <w:rPr>
                 <w:rFonts w:ascii="Arial" w:hAnsi="Arial"/>
@@ -3813,11 +4586,17 @@
         </w:tc>
       </w:tr>
       <w:tr>
+        <w:trPr>
+          <w:cantSplit/>
+        </w:trPr>
         <w:tc>
           <w:tcPr>
             <w:tcW w:type="dxa" w:w="2160"/>
           </w:tcPr>
           <w:p>
+            <w:pPr>
+              <w:keepNext/>
+            </w:pPr>
             <w:r>
               <w:rPr>
                 <w:rFonts w:ascii="Arial" w:hAnsi="Arial"/>
@@ -3832,6 +4611,9 @@
             <w:tcW w:type="dxa" w:w="2160"/>
           </w:tcPr>
           <w:p>
+            <w:pPr>
+              <w:keepNext/>
+            </w:pPr>
             <w:r>
               <w:rPr>
                 <w:rFonts w:ascii="Arial" w:hAnsi="Arial"/>
@@ -3846,6 +4628,9 @@
             <w:tcW w:type="dxa" w:w="2160"/>
           </w:tcPr>
           <w:p>
+            <w:pPr>
+              <w:keepNext/>
+            </w:pPr>
             <w:r>
               <w:rPr>
                 <w:rFonts w:ascii="Arial" w:hAnsi="Arial"/>
@@ -3860,6 +4645,9 @@
             <w:tcW w:type="dxa" w:w="2160"/>
           </w:tcPr>
           <w:p>
+            <w:pPr>
+              <w:keepNext/>
+            </w:pPr>
             <w:r>
               <w:rPr>
                 <w:rFonts w:ascii="Arial" w:hAnsi="Arial"/>
@@ -3871,11 +4659,17 @@
         </w:tc>
       </w:tr>
       <w:tr>
+        <w:trPr>
+          <w:cantSplit/>
+        </w:trPr>
         <w:tc>
           <w:tcPr>
             <w:tcW w:type="dxa" w:w="2160"/>
           </w:tcPr>
           <w:p>
+            <w:pPr>
+              <w:keepNext/>
+            </w:pPr>
             <w:r>
               <w:rPr>
                 <w:rFonts w:ascii="Arial" w:hAnsi="Arial"/>
@@ -3890,12 +4684,15 @@
             <w:tcW w:type="dxa" w:w="2160"/>
           </w:tcPr>
           <w:p>
+            <w:pPr>
+              <w:keepNext/>
+            </w:pPr>
             <w:r>
               <w:rPr>
                 <w:rFonts w:ascii="Arial" w:hAnsi="Arial"/>
                 <w:sz w:val="20"/>
               </w:rPr>
-              <w:t>330 µF</w:t>
+              <w:t>100 µF</w:t>
             </w:r>
           </w:p>
         </w:tc>
@@ -3904,6 +4701,9 @@
             <w:tcW w:type="dxa" w:w="2160"/>
           </w:tcPr>
           <w:p>
+            <w:pPr>
+              <w:keepNext/>
+            </w:pPr>
             <w:r>
               <w:rPr>
                 <w:rFonts w:ascii="Arial" w:hAnsi="Arial"/>
@@ -3918,22 +4718,31 @@
             <w:tcW w:type="dxa" w:w="2160"/>
           </w:tcPr>
           <w:p>
+            <w:pPr>
+              <w:keepNext/>
+            </w:pPr>
             <w:r>
               <w:rPr>
                 <w:rFonts w:ascii="Arial" w:hAnsi="Arial"/>
                 <w:sz w:val="20"/>
               </w:rPr>
-              <w:t>Bulk capacitor (electrolytic)</w:t>
+              <w:t>Bulk capacitor on the 5 V input (electrolytic)</w:t>
             </w:r>
           </w:p>
         </w:tc>
       </w:tr>
       <w:tr>
+        <w:trPr>
+          <w:cantSplit/>
+        </w:trPr>
         <w:tc>
           <w:tcPr>
             <w:tcW w:type="dxa" w:w="2160"/>
           </w:tcPr>
           <w:p>
+            <w:pPr>
+              <w:keepNext/>
+            </w:pPr>
             <w:r>
               <w:rPr>
                 <w:rFonts w:ascii="Arial" w:hAnsi="Arial"/>
@@ -3948,12 +4757,15 @@
             <w:tcW w:type="dxa" w:w="2160"/>
           </w:tcPr>
           <w:p>
+            <w:pPr>
+              <w:keepNext/>
+            </w:pPr>
             <w:r>
               <w:rPr>
                 <w:rFonts w:ascii="Arial" w:hAnsi="Arial"/>
                 <w:sz w:val="20"/>
               </w:rPr>
-              <w:t>100 µF</w:t>
+              <w:t>10 µF</w:t>
             </w:r>
           </w:p>
         </w:tc>
@@ -3962,6 +4774,9 @@
             <w:tcW w:type="dxa" w:w="2160"/>
           </w:tcPr>
           <w:p>
+            <w:pPr>
+              <w:keepNext/>
+            </w:pPr>
             <w:r>
               <w:rPr>
                 <w:rFonts w:ascii="Arial" w:hAnsi="Arial"/>
@@ -3976,12 +4791,76 @@
             <w:tcW w:type="dxa" w:w="2160"/>
           </w:tcPr>
           <w:p>
+            <w:pPr>
+              <w:keepNext/>
+            </w:pPr>
             <w:r>
               <w:rPr>
                 <w:rFonts w:ascii="Arial" w:hAnsi="Arial"/>
                 <w:sz w:val="20"/>
               </w:rPr>
-              <w:t>Bulk capacitor (electrolytic)</w:t>
+              <w:t>Bulk capacitor on the GPS supply, after FB (electrolytic)</w:t>
+            </w:r>
+          </w:p>
+        </w:tc>
+      </w:tr>
+      <w:tr>
+        <w:trPr>
+          <w:cantSplit/>
+        </w:trPr>
+        <w:tc>
+          <w:tcPr>
+            <w:tcW w:type="dxa" w:w="2160"/>
+          </w:tcPr>
+          <w:p>
+            <w:r>
+              <w:rPr>
+                <w:rFonts w:ascii="Arial" w:hAnsi="Arial"/>
+                <w:sz w:val="20"/>
+              </w:rPr>
+              <w:t>C8, C9</w:t>
+            </w:r>
+          </w:p>
+        </w:tc>
+        <w:tc>
+          <w:tcPr>
+            <w:tcW w:type="dxa" w:w="2160"/>
+          </w:tcPr>
+          <w:p>
+            <w:r>
+              <w:rPr>
+                <w:rFonts w:ascii="Arial" w:hAnsi="Arial"/>
+                <w:sz w:val="20"/>
+              </w:rPr>
+              <w:t>1 µF</w:t>
+            </w:r>
+          </w:p>
+        </w:tc>
+        <w:tc>
+          <w:tcPr>
+            <w:tcW w:type="dxa" w:w="2160"/>
+          </w:tcPr>
+          <w:p>
+            <w:r>
+              <w:rPr>
+                <w:rFonts w:ascii="Arial" w:hAnsi="Arial"/>
+                <w:sz w:val="20"/>
+              </w:rPr>
+              <w:t>2</w:t>
+            </w:r>
+          </w:p>
+        </w:tc>
+        <w:tc>
+          <w:tcPr>
+            <w:tcW w:type="dxa" w:w="2160"/>
+          </w:tcPr>
+          <w:p>
+            <w:r>
+              <w:rPr>
+                <w:rFonts w:ascii="Arial" w:hAnsi="Arial"/>
+                <w:sz w:val="20"/>
+              </w:rPr>
+              <w:t>LDO input and output capacitors (U3)</w:t>
             </w:r>
           </w:p>
         </w:tc>
@@ -4016,12 +4895,18 @@
         <w:gridCol w:w="2160"/>
       </w:tblGrid>
       <w:tr>
+        <w:trPr>
+          <w:cantSplit/>
+        </w:trPr>
         <w:tc>
           <w:tcPr>
             <w:tcW w:type="dxa" w:w="2160"/>
             <w:shd w:val="clear" w:color="auto" w:fill="C25600"/>
           </w:tcPr>
           <w:p>
+            <w:pPr>
+              <w:keepNext/>
+            </w:pPr>
             <w:r>
               <w:rPr>
                 <w:rFonts w:ascii="Arial" w:hAnsi="Arial"/>
@@ -4039,6 +4924,9 @@
             <w:shd w:val="clear" w:color="auto" w:fill="C25600"/>
           </w:tcPr>
           <w:p>
+            <w:pPr>
+              <w:keepNext/>
+            </w:pPr>
             <w:r>
               <w:rPr>
                 <w:rFonts w:ascii="Arial" w:hAnsi="Arial"/>
@@ -4056,6 +4944,9 @@
             <w:shd w:val="clear" w:color="auto" w:fill="C25600"/>
           </w:tcPr>
           <w:p>
+            <w:pPr>
+              <w:keepNext/>
+            </w:pPr>
             <w:r>
               <w:rPr>
                 <w:rFonts w:ascii="Arial" w:hAnsi="Arial"/>
@@ -4073,6 +4964,9 @@
             <w:shd w:val="clear" w:color="auto" w:fill="C25600"/>
           </w:tcPr>
           <w:p>
+            <w:pPr>
+              <w:keepNext/>
+            </w:pPr>
             <w:r>
               <w:rPr>
                 <w:rFonts w:ascii="Arial" w:hAnsi="Arial"/>
@@ -4086,11 +4980,17 @@
         </w:tc>
       </w:tr>
       <w:tr>
+        <w:trPr>
+          <w:cantSplit/>
+        </w:trPr>
         <w:tc>
           <w:tcPr>
             <w:tcW w:type="dxa" w:w="2160"/>
           </w:tcPr>
           <w:p>
+            <w:pPr>
+              <w:keepNext/>
+            </w:pPr>
             <w:r>
               <w:rPr>
                 <w:rFonts w:ascii="Arial" w:hAnsi="Arial"/>
@@ -4105,6 +5005,9 @@
             <w:tcW w:type="dxa" w:w="2160"/>
           </w:tcPr>
           <w:p>
+            <w:pPr>
+              <w:keepNext/>
+            </w:pPr>
             <w:r>
               <w:rPr>
                 <w:rFonts w:ascii="Arial" w:hAnsi="Arial"/>
@@ -4119,6 +5022,9 @@
             <w:tcW w:type="dxa" w:w="2160"/>
           </w:tcPr>
           <w:p>
+            <w:pPr>
+              <w:keepNext/>
+            </w:pPr>
             <w:r>
               <w:rPr>
                 <w:rFonts w:ascii="Arial" w:hAnsi="Arial"/>
@@ -4133,6 +5039,9 @@
             <w:tcW w:type="dxa" w:w="2160"/>
           </w:tcPr>
           <w:p>
+            <w:pPr>
+              <w:keepNext/>
+            </w:pPr>
             <w:r>
               <w:rPr>
                 <w:rFonts w:ascii="Arial" w:hAnsi="Arial"/>
@@ -4144,11 +5053,17 @@
         </w:tc>
       </w:tr>
       <w:tr>
+        <w:trPr>
+          <w:cantSplit/>
+        </w:trPr>
         <w:tc>
           <w:tcPr>
             <w:tcW w:type="dxa" w:w="2160"/>
           </w:tcPr>
           <w:p>
+            <w:pPr>
+              <w:keepNext/>
+            </w:pPr>
             <w:r>
               <w:rPr>
                 <w:rFonts w:ascii="Arial" w:hAnsi="Arial"/>
@@ -4163,6 +5078,9 @@
             <w:tcW w:type="dxa" w:w="2160"/>
           </w:tcPr>
           <w:p>
+            <w:pPr>
+              <w:keepNext/>
+            </w:pPr>
             <w:r>
               <w:rPr>
                 <w:rFonts w:ascii="Arial" w:hAnsi="Arial"/>
@@ -4177,6 +5095,9 @@
             <w:tcW w:type="dxa" w:w="2160"/>
           </w:tcPr>
           <w:p>
+            <w:pPr>
+              <w:keepNext/>
+            </w:pPr>
             <w:r>
               <w:rPr>
                 <w:rFonts w:ascii="Arial" w:hAnsi="Arial"/>
@@ -4191,6 +5112,9 @@
             <w:tcW w:type="dxa" w:w="2160"/>
           </w:tcPr>
           <w:p>
+            <w:pPr>
+              <w:keepNext/>
+            </w:pPr>
             <w:r>
               <w:rPr>
                 <w:rFonts w:ascii="Arial" w:hAnsi="Arial"/>
@@ -4202,11 +5126,17 @@
         </w:tc>
       </w:tr>
       <w:tr>
+        <w:trPr>
+          <w:cantSplit/>
+        </w:trPr>
         <w:tc>
           <w:tcPr>
             <w:tcW w:type="dxa" w:w="2160"/>
           </w:tcPr>
           <w:p>
+            <w:pPr>
+              <w:keepNext/>
+            </w:pPr>
             <w:r>
               <w:rPr>
                 <w:rFonts w:ascii="Arial" w:hAnsi="Arial"/>
@@ -4221,6 +5151,9 @@
             <w:tcW w:type="dxa" w:w="2160"/>
           </w:tcPr>
           <w:p>
+            <w:pPr>
+              <w:keepNext/>
+            </w:pPr>
             <w:r>
               <w:rPr>
                 <w:rFonts w:ascii="Arial" w:hAnsi="Arial"/>
@@ -4235,6 +5168,9 @@
             <w:tcW w:type="dxa" w:w="2160"/>
           </w:tcPr>
           <w:p>
+            <w:pPr>
+              <w:keepNext/>
+            </w:pPr>
             <w:r>
               <w:rPr>
                 <w:rFonts w:ascii="Arial" w:hAnsi="Arial"/>
@@ -4249,6 +5185,9 @@
             <w:tcW w:type="dxa" w:w="2160"/>
           </w:tcPr>
           <w:p>
+            <w:pPr>
+              <w:keepNext/>
+            </w:pPr>
             <w:r>
               <w:rPr>
                 <w:rFonts w:ascii="Arial" w:hAnsi="Arial"/>
@@ -4260,6 +5199,82 @@
         </w:tc>
       </w:tr>
       <w:tr>
+        <w:trPr>
+          <w:cantSplit/>
+        </w:trPr>
+        <w:tc>
+          <w:tcPr>
+            <w:tcW w:type="dxa" w:w="2160"/>
+          </w:tcPr>
+          <w:p>
+            <w:pPr>
+              <w:keepNext/>
+            </w:pPr>
+            <w:r>
+              <w:rPr>
+                <w:rFonts w:ascii="Arial" w:hAnsi="Arial"/>
+                <w:sz w:val="20"/>
+              </w:rPr>
+              <w:t>J4</w:t>
+            </w:r>
+          </w:p>
+        </w:tc>
+        <w:tc>
+          <w:tcPr>
+            <w:tcW w:type="dxa" w:w="2160"/>
+          </w:tcPr>
+          <w:p>
+            <w:pPr>
+              <w:keepNext/>
+            </w:pPr>
+            <w:r>
+              <w:rPr>
+                <w:rFonts w:ascii="Arial" w:hAnsi="Arial"/>
+                <w:sz w:val="20"/>
+              </w:rPr>
+              <w:t>HDR-1x4 (4-pin header)</w:t>
+            </w:r>
+          </w:p>
+        </w:tc>
+        <w:tc>
+          <w:tcPr>
+            <w:tcW w:type="dxa" w:w="2160"/>
+          </w:tcPr>
+          <w:p>
+            <w:pPr>
+              <w:keepNext/>
+            </w:pPr>
+            <w:r>
+              <w:rPr>
+                <w:rFonts w:ascii="Arial" w:hAnsi="Arial"/>
+                <w:sz w:val="20"/>
+              </w:rPr>
+              <w:t>1</w:t>
+            </w:r>
+          </w:p>
+        </w:tc>
+        <w:tc>
+          <w:tcPr>
+            <w:tcW w:type="dxa" w:w="2160"/>
+          </w:tcPr>
+          <w:p>
+            <w:pPr>
+              <w:keepNext/>
+            </w:pPr>
+            <w:r>
+              <w:rPr>
+                <w:rFonts w:ascii="Arial" w:hAnsi="Arial"/>
+                <w:sz w:val="20"/>
+              </w:rPr>
+              <w:t>Environmental sensor — BME280 or BME688, I²C (silkscreen: SDA, SCL, GND, 3.3v). Omit if no sensor is fitted</w:t>
+            </w:r>
+          </w:p>
+        </w:tc>
+      </w:tr>
+      <w:tr>
+        <w:trPr>
+          <w:cantSplit/>
+        </w:trPr>
         <w:tc>
           <w:tcPr>
             <w:tcW w:type="dxa" w:w="2160"/>
@@ -4312,65 +5327,7 @@
                 <w:rFonts w:ascii="Arial" w:hAnsi="Arial"/>
                 <w:sz w:val="20"/>
               </w:rPr>
-              <w:t>IP readout (double-click), OTA update (10 s hold)</w:t>
-            </w:r>
-          </w:p>
-        </w:tc>
-      </w:tr>
-      <w:tr>
-        <w:tc>
-          <w:tcPr>
-            <w:tcW w:type="dxa" w:w="2160"/>
-          </w:tcPr>
-          <w:p>
-            <w:r>
-              <w:rPr>
-                <w:rFonts w:ascii="Arial" w:hAnsi="Arial"/>
-                <w:sz w:val="20"/>
-              </w:rPr>
-              <w:t>SW2</w:t>
-            </w:r>
-          </w:p>
-        </w:tc>
-        <w:tc>
-          <w:tcPr>
-            <w:tcW w:type="dxa" w:w="2160"/>
-          </w:tcPr>
-          <w:p>
-            <w:r>
-              <w:rPr>
-                <w:rFonts w:ascii="Arial" w:hAnsi="Arial"/>
-                <w:sz w:val="20"/>
-              </w:rPr>
-              <w:t>Tactile pushbutton</w:t>
-            </w:r>
-          </w:p>
-        </w:tc>
-        <w:tc>
-          <w:tcPr>
-            <w:tcW w:type="dxa" w:w="2160"/>
-          </w:tcPr>
-          <w:p>
-            <w:r>
-              <w:rPr>
-                <w:rFonts w:ascii="Arial" w:hAnsi="Arial"/>
-                <w:sz w:val="20"/>
-              </w:rPr>
-              <w:t>1</w:t>
-            </w:r>
-          </w:p>
-        </w:tc>
-        <w:tc>
-          <w:tcPr>
-            <w:tcW w:type="dxa" w:w="2160"/>
-          </w:tcPr>
-          <w:p>
-            <w:r>
-              <w:rPr>
-                <w:rFonts w:ascii="Arial" w:hAnsi="Arial"/>
-                <w:sz w:val="20"/>
-              </w:rPr>
-              <w:t>EN — hardware reset (no firmware)</w:t>
+              <w:t>Function button — IP readout (double-click), AP mode (5 s hold), OTA update (10 s hold)</w:t>
             </w:r>
           </w:p>
         </w:tc>
@@ -4380,8 +5337,8 @@
     <w:p>
       <w:pPr>
         <w:sectPr>
-          <w:headerReference w:type="default" r:id="rId27"/>
-          <w:footerReference w:type="default" r:id="rId28"/>
+          <w:headerReference w:type="default" r:id="rId28"/>
+          <w:footerReference w:type="default" r:id="rId29"/>
           <w:pgSz w:w="12240" w:h="15840"/>
           <w:pgMar w:top="1440" w:right="1800" w:bottom="1440" w:left="1800" w:header="720" w:footer="720" w:gutter="0"/>
           <w:cols w:space="720"/>
@@ -4433,7 +5390,7 @@
           <w:rFonts w:ascii="Arial" w:hAnsi="Arial"/>
           <w:sz w:val="22"/>
         </w:rPr>
-        <w:t>The InfoServer is documented on a single schematic sheet in the DipTrace project (NTPServer2.dch). The signal connections below are fixed in the firmware pin map and are the authoritative reference for bring-up and debugging.</w:t>
+        <w:t>The InfoServer is documented on a single schematic sheet in the DipTrace project (InfoServer2.dch), reproduced as Figure 3 at the end of this appendix. The signal connections below are fixed in the firmware pin map and are the authoritative reference for bring-up and debugging.</w:t>
       </w:r>
     </w:p>
     <w:p>
@@ -4464,6 +5421,9 @@
         <w:gridCol w:w="2160"/>
       </w:tblGrid>
       <w:tr>
+        <w:trPr>
+          <w:cantSplit/>
+        </w:trPr>
         <w:tc>
           <w:tcPr>
             <w:tcW w:type="dxa" w:w="2160"/>
@@ -4534,6 +5494,9 @@
         </w:tc>
       </w:tr>
       <w:tr>
+        <w:trPr>
+          <w:cantSplit/>
+        </w:trPr>
         <w:tc>
           <w:tcPr>
             <w:tcW w:type="dxa" w:w="2160"/>
@@ -4592,6 +5555,9 @@
         </w:tc>
       </w:tr>
       <w:tr>
+        <w:trPr>
+          <w:cantSplit/>
+        </w:trPr>
         <w:tc>
           <w:tcPr>
             <w:tcW w:type="dxa" w:w="2160"/>
@@ -4650,6 +5616,9 @@
         </w:tc>
       </w:tr>
       <w:tr>
+        <w:trPr>
+          <w:cantSplit/>
+        </w:trPr>
         <w:tc>
           <w:tcPr>
             <w:tcW w:type="dxa" w:w="2160"/>
@@ -4708,6 +5677,9 @@
         </w:tc>
       </w:tr>
       <w:tr>
+        <w:trPr>
+          <w:cantSplit/>
+        </w:trPr>
         <w:tc>
           <w:tcPr>
             <w:tcW w:type="dxa" w:w="2160"/>
@@ -4746,7 +5718,7 @@
                 <w:rFonts w:ascii="Arial" w:hAnsi="Arial"/>
                 <w:sz w:val="20"/>
               </w:rPr>
-              <w:t>GPIO10</w:t>
+              <w:t>— (none)</w:t>
             </w:r>
           </w:p>
         </w:tc>
@@ -4760,12 +5732,15 @@
                 <w:rFonts w:ascii="Arial" w:hAnsi="Arial"/>
                 <w:sz w:val="20"/>
               </w:rPr>
-              <w:t>Pulled up by R1; not driven by firmware</w:t>
+              <w:t>Pulled up by R1; its own net, not connected to the MCU</w:t>
             </w:r>
           </w:p>
         </w:tc>
       </w:tr>
       <w:tr>
+        <w:trPr>
+          <w:cantSplit/>
+        </w:trPr>
         <w:tc>
           <w:tcPr>
             <w:tcW w:type="dxa" w:w="2160"/>
@@ -4824,6 +5799,9 @@
         </w:tc>
       </w:tr>
       <w:tr>
+        <w:trPr>
+          <w:cantSplit/>
+        </w:trPr>
         <w:tc>
           <w:tcPr>
             <w:tcW w:type="dxa" w:w="2160"/>
@@ -4882,6 +5860,9 @@
         </w:tc>
       </w:tr>
       <w:tr>
+        <w:trPr>
+          <w:cantSplit/>
+        </w:trPr>
         <w:tc>
           <w:tcPr>
             <w:tcW w:type="dxa" w:w="2160"/>
@@ -4940,6 +5921,9 @@
         </w:tc>
       </w:tr>
       <w:tr>
+        <w:trPr>
+          <w:cantSplit/>
+        </w:trPr>
         <w:tc>
           <w:tcPr>
             <w:tcW w:type="dxa" w:w="2160"/>
@@ -4992,12 +5976,15 @@
                 <w:rFonts w:ascii="Arial" w:hAnsi="Arial"/>
                 <w:sz w:val="20"/>
               </w:rPr>
-              <w:t>Idle INPUT_PULLUP; reserved for watchdog reset</w:t>
+              <w:t>Active LOW; idle INPUT_PULLUP, plus the R10 pull-up to the GPS supply</w:t>
             </w:r>
           </w:p>
         </w:tc>
       </w:tr>
       <w:tr>
+        <w:trPr>
+          <w:cantSplit/>
+        </w:trPr>
         <w:tc>
           <w:tcPr>
             <w:tcW w:type="dxa" w:w="2160"/>
@@ -5056,6 +6043,9 @@
         </w:tc>
       </w:tr>
       <w:tr>
+        <w:trPr>
+          <w:cantSplit/>
+        </w:trPr>
         <w:tc>
           <w:tcPr>
             <w:tcW w:type="dxa" w:w="2160"/>
@@ -5114,6 +6104,9 @@
         </w:tc>
       </w:tr>
       <w:tr>
+        <w:trPr>
+          <w:cantSplit/>
+        </w:trPr>
         <w:tc>
           <w:tcPr>
             <w:tcW w:type="dxa" w:w="2160"/>
@@ -5172,6 +6165,9 @@
         </w:tc>
       </w:tr>
       <w:tr>
+        <w:trPr>
+          <w:cantSplit/>
+        </w:trPr>
         <w:tc>
           <w:tcPr>
             <w:tcW w:type="dxa" w:w="2160"/>
@@ -5182,7 +6178,7 @@
                 <w:rFonts w:ascii="Arial" w:hAnsi="Arial"/>
                 <w:sz w:val="20"/>
               </w:rPr>
-              <w:t>Reset button</w:t>
+              <w:t>BME sensor (optional)</w:t>
             </w:r>
           </w:p>
         </w:tc>
@@ -5196,7 +6192,7 @@
                 <w:rFonts w:ascii="Arial" w:hAnsi="Arial"/>
                 <w:sz w:val="20"/>
               </w:rPr>
-              <w:t>EN</w:t>
+              <w:t>SDA / SCL</w:t>
             </w:r>
           </w:p>
         </w:tc>
@@ -5210,7 +6206,7 @@
                 <w:rFonts w:ascii="Arial" w:hAnsi="Arial"/>
                 <w:sz w:val="20"/>
               </w:rPr>
-              <w:t>SW2</w:t>
+              <w:t>GPIO8 / GPIO9</w:t>
             </w:r>
           </w:p>
         </w:tc>
@@ -5224,12 +6220,137 @@
                 <w:rFonts w:ascii="Arial" w:hAnsi="Arial"/>
                 <w:sz w:val="20"/>
               </w:rPr>
-              <w:t>Hardware reset — no firmware</w:t>
+              <w:t>BME280 or BME688 — shares the DS3231 I²C bus; broken out on J4</w:t>
             </w:r>
           </w:p>
         </w:tc>
       </w:tr>
       <w:tr>
+        <w:trPr>
+          <w:cantSplit/>
+        </w:trPr>
+        <w:tc>
+          <w:tcPr>
+            <w:tcW w:type="dxa" w:w="2160"/>
+          </w:tcPr>
+          <w:p>
+            <w:r>
+              <w:rPr>
+                <w:rFonts w:ascii="Arial" w:hAnsi="Arial"/>
+                <w:sz w:val="20"/>
+              </w:rPr>
+              <w:t>SEN66 sensor (optional)</w:t>
+            </w:r>
+          </w:p>
+        </w:tc>
+        <w:tc>
+          <w:tcPr>
+            <w:tcW w:type="dxa" w:w="2160"/>
+          </w:tcPr>
+          <w:p>
+            <w:r>
+              <w:rPr>
+                <w:rFonts w:ascii="Arial" w:hAnsi="Arial"/>
+                <w:sz w:val="20"/>
+              </w:rPr>
+              <w:t>SDA / SCL</w:t>
+            </w:r>
+          </w:p>
+        </w:tc>
+        <w:tc>
+          <w:tcPr>
+            <w:tcW w:type="dxa" w:w="2160"/>
+          </w:tcPr>
+          <w:p>
+            <w:r>
+              <w:rPr>
+                <w:rFonts w:ascii="Arial" w:hAnsi="Arial"/>
+                <w:sz w:val="20"/>
+              </w:rPr>
+              <w:t>GPIO8 / GPIO9</w:t>
+            </w:r>
+          </w:p>
+        </w:tc>
+        <w:tc>
+          <w:tcPr>
+            <w:tcW w:type="dxa" w:w="2160"/>
+          </w:tcPr>
+          <w:p>
+            <w:r>
+              <w:rPr>
+                <w:rFonts w:ascii="Arial" w:hAnsi="Arial"/>
+                <w:sz w:val="20"/>
+              </w:rPr>
+              <w:t>Same I²C bus, address 0x6B, on a short ribbon cable. Its presence drops the bus to 100 kHz (the SEN66 ceiling); without it the bus runs at 400 kHz</w:t>
+            </w:r>
+          </w:p>
+        </w:tc>
+      </w:tr>
+      <w:tr>
+        <w:trPr>
+          <w:cantSplit/>
+        </w:trPr>
+        <w:tc>
+          <w:tcPr>
+            <w:tcW w:type="dxa" w:w="2160"/>
+          </w:tcPr>
+          <w:p>
+            <w:r>
+              <w:rPr>
+                <w:rFonts w:ascii="Arial" w:hAnsi="Arial"/>
+                <w:sz w:val="20"/>
+              </w:rPr>
+              <w:t>Reset / boot</w:t>
+            </w:r>
+          </w:p>
+        </w:tc>
+        <w:tc>
+          <w:tcPr>
+            <w:tcW w:type="dxa" w:w="2160"/>
+          </w:tcPr>
+          <w:p>
+            <w:r>
+              <w:rPr>
+                <w:rFonts w:ascii="Arial" w:hAnsi="Arial"/>
+                <w:sz w:val="20"/>
+              </w:rPr>
+              <w:t>EN / IO0</w:t>
+            </w:r>
+          </w:p>
+        </w:tc>
+        <w:tc>
+          <w:tcPr>
+            <w:tcW w:type="dxa" w:w="2160"/>
+          </w:tcPr>
+          <w:p>
+            <w:r>
+              <w:rPr>
+                <w:rFonts w:ascii="Arial" w:hAnsi="Arial"/>
+                <w:sz w:val="20"/>
+              </w:rPr>
+              <w:t>J2 pins 4, 5</w:t>
+            </w:r>
+          </w:p>
+        </w:tc>
+        <w:tc>
+          <w:tcPr>
+            <w:tcW w:type="dxa" w:w="2160"/>
+          </w:tcPr>
+          <w:p>
+            <w:r>
+              <w:rPr>
+                <w:rFonts w:ascii="Arial" w:hAnsi="Arial"/>
+                <w:sz w:val="20"/>
+              </w:rPr>
+              <w:t>Pulled up by R4 and R7; no on-board button</w:t>
+            </w:r>
+          </w:p>
+        </w:tc>
+      </w:tr>
+      <w:tr>
+        <w:trPr>
+          <w:cantSplit/>
+        </w:trPr>
         <w:tc>
           <w:tcPr>
             <w:tcW w:type="dxa" w:w="2160"/>
@@ -5282,7 +6403,7 @@
                 <w:rFonts w:ascii="Arial" w:hAnsi="Arial"/>
                 <w:sz w:val="20"/>
               </w:rPr>
-              <w:t>3.3 V rail derived on-board</w:t>
+              <w:t>3.3 V rail derived on-board by U3</w:t>
             </w:r>
           </w:p>
         </w:tc>
@@ -5300,9 +6421,64 @@
     </w:p>
     <w:p>
       <w:pPr>
+        <w:spacing w:before="160" w:after="40"/>
+        <w:jc w:val="center"/>
+      </w:pPr>
+      <w:r>
+        <w:drawing>
+          <wp:inline xmlns:a="http://schemas.openxmlformats.org/drawingml/2006/main" xmlns:pic="http://schemas.openxmlformats.org/drawingml/2006/picture">
+            <wp:extent cx="5852160" cy="7678846"/>
+            <wp:docPr id="3" name="Picture 3"/>
+            <wp:cNvGraphicFramePr>
+              <a:graphicFrameLocks noChangeAspect="1"/>
+            </wp:cNvGraphicFramePr>
+            <a:graphic>
+              <a:graphicData uri="http://schemas.openxmlformats.org/drawingml/2006/picture">
+                <pic:pic>
+                  <pic:nvPicPr>
+                    <pic:cNvPr id="0" name="schematic_plate.png"/>
+                    <pic:cNvPicPr/>
+                  </pic:nvPicPr>
+                  <pic:blipFill>
+                    <a:blip r:embed="rId11"/>
+                    <a:stretch>
+                      <a:fillRect/>
+                    </a:stretch>
+                  </pic:blipFill>
+                  <pic:spPr>
+                    <a:xfrm>
+                      <a:off x="0" y="0"/>
+                      <a:ext cx="5852160" cy="7678846"/>
+                    </a:xfrm>
+                    <a:prstGeom prst="rect"/>
+                  </pic:spPr>
+                </pic:pic>
+              </a:graphicData>
+            </a:graphic>
+          </wp:inline>
+        </w:drawing>
+      </w:r>
+    </w:p>
+    <w:p>
+      <w:pPr>
+        <w:spacing w:before="0" w:after="160"/>
+        <w:jc w:val="center"/>
+      </w:pPr>
+      <w:r>
+        <w:rPr>
+          <w:rFonts w:ascii="Arial" w:hAnsi="Arial"/>
+          <w:i/>
+          <w:color w:val="555555"/>
+          <w:sz w:val="20"/>
+        </w:rPr>
+        <w:t>Figure 3 — InfoServer Rev. 6 schematic (single sheet), rotated a quarter turn to print as large as the page allows. The pin map on the preceding page is the quicker lookup for an individual signal.</w:t>
+      </w:r>
+    </w:p>
+    <w:p>
+      <w:pPr>
         <w:sectPr>
-          <w:headerReference w:type="default" r:id="rId29"/>
-          <w:footerReference w:type="default" r:id="rId30"/>
+          <w:headerReference w:type="default" r:id="rId30"/>
+          <w:footerReference w:type="default" r:id="rId31"/>
           <w:pgSz w:w="12240" w:h="15840"/>
           <w:pgMar w:top="1440" w:right="1800" w:bottom="1440" w:left="1800" w:header="720" w:footer="720" w:gutter="0"/>
           <w:cols w:space="720"/>
@@ -5385,8 +6561,8 @@
       </w:r>
     </w:p>
     <w:sectPr>
-      <w:headerReference w:type="default" r:id="rId31"/>
-      <w:footerReference w:type="default" r:id="rId32"/>
+      <w:headerReference w:type="default" r:id="rId32"/>
+      <w:footerReference w:type="default" r:id="rId33"/>
       <w:pgSz w:w="12240" w:h="15840"/>
       <w:pgMar w:top="1440" w:right="1800" w:bottom="1440" w:left="1800" w:header="720" w:footer="720" w:gutter="0"/>
       <w:cols w:space="720"/>
@@ -5426,7 +6602,7 @@
         <w:color w:val="555555"/>
         <w:sz w:val="20"/>
       </w:rPr>
-      <w:t>Hardware Rev 2 — Document Rev 1.2 — July 2026</w:t>
+      <w:t>Hardware Rev 6 — Document Rev 1.5 — October 2026</w:t>
     </w:r>
     <w:r>
       <w:rPr>
@@ -5477,7 +6653,7 @@
         <w:color w:val="555555"/>
         <w:sz w:val="20"/>
       </w:rPr>
-      <w:t>Hardware Rev 2 — Document Rev 1.2 — July 2026</w:t>
+      <w:t>Hardware Rev 6 — Document Rev 1.5 — October 2026</w:t>
     </w:r>
   </w:p>
 </w:ftr>
@@ -5501,7 +6677,7 @@
         <w:color w:val="555555"/>
         <w:sz w:val="20"/>
       </w:rPr>
-      <w:t>Hardware Rev 2 — Document Rev 1.2 — July 2026</w:t>
+      <w:t>Hardware Rev 6 — Document Rev 1.5 — October 2026</w:t>
     </w:r>
     <w:r>
       <w:rPr>
@@ -5544,7 +6720,7 @@
         <w:color w:val="555555"/>
         <w:sz w:val="20"/>
       </w:rPr>
-      <w:t>Hardware Rev 2 — Document Rev 1.2 — July 2026</w:t>
+      <w:t>Hardware Rev 6 — Document Rev 1.5 — October 2026</w:t>
     </w:r>
     <w:r>
       <w:rPr>
@@ -5595,7 +6771,7 @@
         <w:color w:val="555555"/>
         <w:sz w:val="20"/>
       </w:rPr>
-      <w:t>Hardware Rev 2 — Document Rev 1.2 — July 2026</w:t>
+      <w:t>Hardware Rev 6 — Document Rev 1.5 — October 2026</w:t>
     </w:r>
     <w:r>
       <w:rPr>
@@ -5646,7 +6822,7 @@
         <w:color w:val="555555"/>
         <w:sz w:val="20"/>
       </w:rPr>
-      <w:t>Hardware Rev 2 — Document Rev 1.2 — July 2026</w:t>
+      <w:t>Hardware Rev 6 — Document Rev 1.5 — October 2026</w:t>
     </w:r>
     <w:r>
       <w:rPr>
@@ -5697,7 +6873,7 @@
         <w:color w:val="555555"/>
         <w:sz w:val="20"/>
       </w:rPr>
-      <w:t>Hardware Rev 2 — Document Rev 1.2 — July 2026</w:t>
+      <w:t>Hardware Rev 6 — Document Rev 1.5 — October 2026</w:t>
     </w:r>
     <w:r>
       <w:rPr>
@@ -5748,7 +6924,7 @@
         <w:color w:val="555555"/>
         <w:sz w:val="20"/>
       </w:rPr>
-      <w:t>Hardware Rev 2 — Document Rev 1.2 — July 2026</w:t>
+      <w:t>Hardware Rev 6 — Document Rev 1.5 — October 2026</w:t>
     </w:r>
     <w:r>
       <w:rPr>
@@ -5799,7 +6975,7 @@
         <w:color w:val="555555"/>
         <w:sz w:val="20"/>
       </w:rPr>
-      <w:t>Hardware Rev 2 — Document Rev 1.2 — July 2026</w:t>
+      <w:t>Hardware Rev 6 — Document Rev 1.5 — October 2026</w:t>
     </w:r>
     <w:r>
       <w:rPr>
@@ -5850,7 +7026,7 @@
         <w:color w:val="555555"/>
         <w:sz w:val="20"/>
       </w:rPr>
-      <w:t>Hardware Rev 2 — Document Rev 1.2 — July 2026</w:t>
+      <w:t>Hardware Rev 6 — Document Rev 1.5 — October 2026</w:t>
     </w:r>
     <w:r>
       <w:rPr>

</xml_diff>

<commit_message>
Zev-7 Operator Manual: S3 uniformity (Zev-7S/Zev-7N 3.4, Metronome-S 1.3) - rule keys br and it/ip/ih with the original Zev-7 and Metronome keys kept, factory reset after the update, Access Point / mDNS Name, Static IP, Live Form, Metronome-S weather and Information layout, settings tables matched to the firmware; InfoServer operator manual revision 12 and assembly Document Rev 1.6 (firmware 1.9)
</commit_message>
<xml_diff>
--- a/InfoServer Assembly Manual.docx
+++ b/InfoServer Assembly Manual.docx
@@ -141,7 +141,7 @@
                 <w:rFonts w:ascii="Arial" w:hAnsi="Arial"/>
                 <w:sz w:val="22"/>
               </w:rPr>
-              <w:t>Document Revision 1.5</w:t>
+              <w:t>Document Revision 1.6</w:t>
             </w:r>
           </w:p>
         </w:tc>
@@ -207,7 +207,7 @@
                 <w:rFonts w:ascii="Arial" w:hAnsi="Arial"/>
                 <w:sz w:val="22"/>
               </w:rPr>
-              <w:t>1.6</w:t>
+              <w:t>1.9</w:t>
             </w:r>
           </w:p>
         </w:tc>
@@ -6602,7 +6602,7 @@
         <w:color w:val="555555"/>
         <w:sz w:val="20"/>
       </w:rPr>
-      <w:t>Hardware Rev 6 — Document Rev 1.5 — October 2026</w:t>
+      <w:t>Hardware Rev 6 — Document Rev 1.6 — October 2026</w:t>
     </w:r>
     <w:r>
       <w:rPr>
@@ -6653,7 +6653,7 @@
         <w:color w:val="555555"/>
         <w:sz w:val="20"/>
       </w:rPr>
-      <w:t>Hardware Rev 6 — Document Rev 1.5 — October 2026</w:t>
+      <w:t>Hardware Rev 6 — Document Rev 1.6 — October 2026</w:t>
     </w:r>
   </w:p>
 </w:ftr>
@@ -6677,7 +6677,7 @@
         <w:color w:val="555555"/>
         <w:sz w:val="20"/>
       </w:rPr>
-      <w:t>Hardware Rev 6 — Document Rev 1.5 — October 2026</w:t>
+      <w:t>Hardware Rev 6 — Document Rev 1.6 — October 2026</w:t>
     </w:r>
     <w:r>
       <w:rPr>
@@ -6720,7 +6720,7 @@
         <w:color w:val="555555"/>
         <w:sz w:val="20"/>
       </w:rPr>
-      <w:t>Hardware Rev 6 — Document Rev 1.5 — October 2026</w:t>
+      <w:t>Hardware Rev 6 — Document Rev 1.6 — October 2026</w:t>
     </w:r>
     <w:r>
       <w:rPr>
@@ -6771,7 +6771,7 @@
         <w:color w:val="555555"/>
         <w:sz w:val="20"/>
       </w:rPr>
-      <w:t>Hardware Rev 6 — Document Rev 1.5 — October 2026</w:t>
+      <w:t>Hardware Rev 6 — Document Rev 1.6 — October 2026</w:t>
     </w:r>
     <w:r>
       <w:rPr>
@@ -6822,7 +6822,7 @@
         <w:color w:val="555555"/>
         <w:sz w:val="20"/>
       </w:rPr>
-      <w:t>Hardware Rev 6 — Document Rev 1.5 — October 2026</w:t>
+      <w:t>Hardware Rev 6 — Document Rev 1.6 — October 2026</w:t>
     </w:r>
     <w:r>
       <w:rPr>
@@ -6873,7 +6873,7 @@
         <w:color w:val="555555"/>
         <w:sz w:val="20"/>
       </w:rPr>
-      <w:t>Hardware Rev 6 — Document Rev 1.5 — October 2026</w:t>
+      <w:t>Hardware Rev 6 — Document Rev 1.6 — October 2026</w:t>
     </w:r>
     <w:r>
       <w:rPr>
@@ -6924,7 +6924,7 @@
         <w:color w:val="555555"/>
         <w:sz w:val="20"/>
       </w:rPr>
-      <w:t>Hardware Rev 6 — Document Rev 1.5 — October 2026</w:t>
+      <w:t>Hardware Rev 6 — Document Rev 1.6 — October 2026</w:t>
     </w:r>
     <w:r>
       <w:rPr>
@@ -6975,7 +6975,7 @@
         <w:color w:val="555555"/>
         <w:sz w:val="20"/>
       </w:rPr>
-      <w:t>Hardware Rev 6 — Document Rev 1.5 — October 2026</w:t>
+      <w:t>Hardware Rev 6 — Document Rev 1.6 — October 2026</w:t>
     </w:r>
     <w:r>
       <w:rPr>
@@ -7026,7 +7026,7 @@
         <w:color w:val="555555"/>
         <w:sz w:val="20"/>
       </w:rPr>
-      <w:t>Hardware Rev 6 — Document Rev 1.5 — October 2026</w:t>
+      <w:t>Hardware Rev 6 — Document Rev 1.6 — October 2026</w:t>
     </w:r>
     <w:r>
       <w:rPr>

</xml_diff>

<commit_message>
Zev-7 and InfoServer manuals: BME680 / BME688 references read BME68x
</commit_message>
<xml_diff>
--- a/InfoServer Assembly Manual.docx
+++ b/InfoServer Assembly Manual.docx
@@ -1745,7 +1745,7 @@
           <w:rFonts w:ascii="Arial" w:hAnsi="Arial"/>
           <w:sz w:val="22"/>
         </w:rPr>
-        <w:t>5.  J4 — the 4-pin environmental sensor header, if a sensor is being fitted. The silkscreen labels each pin (SDA, SCL, GND, 3.3v); match them to the sensor module rather than assuming a pin order. A BME280 or a BME688 may be mounted directly here, or sited away from the board on a short ribbon cable — the firmware identifies which part is fitted at power-on, so no setting has to be changed to match.</w:t>
+        <w:t>5.  J4 — the 4-pin environmental sensor header, if a sensor is being fitted. The silkscreen labels each pin (SDA, SCL, GND, 3.3v); match them to the sensor module rather than assuming a pin order. A BME280 or a BME68x may be mounted directly here, or sited away from the board on a short ribbon cable — the firmware identifies which part is fitted at power-on, so no setting has to be changed to match.</w:t>
       </w:r>
     </w:p>
     <w:p>
@@ -5266,7 +5266,7 @@
                 <w:rFonts w:ascii="Arial" w:hAnsi="Arial"/>
                 <w:sz w:val="20"/>
               </w:rPr>
-              <w:t>Environmental sensor — BME280 or BME688, I²C (silkscreen: SDA, SCL, GND, 3.3v). Omit if no sensor is fitted</w:t>
+              <w:t>Environmental sensor — BME280 or BME68x, I²C (silkscreen: SDA, SCL, GND, 3.3v). Omit if no sensor is fitted</w:t>
             </w:r>
           </w:p>
         </w:tc>
@@ -6220,7 +6220,7 @@
                 <w:rFonts w:ascii="Arial" w:hAnsi="Arial"/>
                 <w:sz w:val="20"/>
               </w:rPr>
-              <w:t>BME280 or BME688 — shares the DS3231 I²C bus; broken out on J4</w:t>
+              <w:t>BME280 or BME68x — shares the DS3231 I²C bus; broken out on J4</w:t>
             </w:r>
           </w:p>
         </w:tc>

</xml_diff>